<commit_message>
doc(rapport): reorganisation du rapport
[120MIN][DONE]
Mise en forme (en-tête, pied de page), reformulation globale et rédaction de la conclusion générale pour un rendu professionnel.
</commit_message>
<xml_diff>
--- a/doc/R-P_Cloud-TeixeiraSottile-Rapport.docx
+++ b/doc/R-P_Cloud-TeixeiraSottile-Rapport.docx
@@ -7,13 +7,8 @@
         <w:pStyle w:val="Titre"/>
       </w:pPr>
       <w:r>
-        <w:t xml:space="preserve">Cloud </w:t>
-      </w:r>
-      <w:proofErr w:type="spellStart"/>
-      <w:r>
-        <w:t>Webapp</w:t>
-      </w:r>
-      <w:proofErr w:type="spellEnd"/>
+        <w:t>Cloud Webapp</w:t>
+      </w:r>
     </w:p>
     <w:p>
       <w:pPr>
@@ -126,13 +121,8 @@
         <w:jc w:val="center"/>
       </w:pPr>
       <w:r>
-        <w:t xml:space="preserve">Gaël </w:t>
-      </w:r>
-      <w:proofErr w:type="spellStart"/>
-      <w:r>
-        <w:t>Sonney</w:t>
-      </w:r>
-      <w:proofErr w:type="spellEnd"/>
+        <w:t>Gaël Sonney</w:t>
+      </w:r>
     </w:p>
     <w:p>
       <w:pPr>
@@ -159,8 +149,10 @@
           <w:bCs w:val="0"/>
           <w:caps w:val="0"/>
           <w:noProof/>
-          <w:sz w:val="22"/>
-          <w:szCs w:val="22"/>
+          <w:kern w:val="2"/>
+          <w:sz w:val="24"/>
+          <w:szCs w:val="24"/>
+          <w14:ligatures w14:val="standardContextual"/>
         </w:rPr>
       </w:pPr>
       <w:r>
@@ -196,7 +188,7 @@
         </w:rPr>
         <w:fldChar w:fldCharType="separate"/>
       </w:r>
-      <w:hyperlink w:anchor="_Toc308526316" w:history="1">
+      <w:hyperlink w:anchor="_Toc218496169" w:history="1">
         <w:r>
           <w:rPr>
             <w:rStyle w:val="Lienhypertexte"/>
@@ -211,8 +203,10 @@
             <w:bCs w:val="0"/>
             <w:caps w:val="0"/>
             <w:noProof/>
-            <w:sz w:val="22"/>
-            <w:szCs w:val="22"/>
+            <w:kern w:val="2"/>
+            <w:sz w:val="24"/>
+            <w:szCs w:val="24"/>
+            <w14:ligatures w14:val="standardContextual"/>
           </w:rPr>
           <w:tab/>
         </w:r>
@@ -242,7 +236,7 @@
             <w:noProof/>
             <w:webHidden/>
           </w:rPr>
-          <w:instrText xml:space="preserve"> PAGEREF _Toc308526316 \h </w:instrText>
+          <w:instrText xml:space="preserve"> PAGEREF _Toc218496169 \h </w:instrText>
         </w:r>
         <w:r>
           <w:rPr>
@@ -284,11 +278,13 @@
           <w:rFonts w:eastAsiaTheme="minorEastAsia" w:cstheme="minorBidi"/>
           <w:smallCaps w:val="0"/>
           <w:noProof/>
-          <w:sz w:val="22"/>
-          <w:szCs w:val="22"/>
+          <w:kern w:val="2"/>
+          <w:sz w:val="24"/>
+          <w:szCs w:val="24"/>
+          <w14:ligatures w14:val="standardContextual"/>
         </w:rPr>
       </w:pPr>
-      <w:hyperlink w:anchor="_Toc308526317" w:history="1">
+      <w:hyperlink w:anchor="_Toc218496170" w:history="1">
         <w:r>
           <w:rPr>
             <w:rStyle w:val="Lienhypertexte"/>
@@ -301,8 +297,10 @@
             <w:rFonts w:eastAsiaTheme="minorEastAsia" w:cstheme="minorBidi"/>
             <w:smallCaps w:val="0"/>
             <w:noProof/>
-            <w:sz w:val="22"/>
-            <w:szCs w:val="22"/>
+            <w:kern w:val="2"/>
+            <w:sz w:val="24"/>
+            <w:szCs w:val="24"/>
+            <w14:ligatures w14:val="standardContextual"/>
           </w:rPr>
           <w:tab/>
         </w:r>
@@ -332,7 +330,7 @@
             <w:noProof/>
             <w:webHidden/>
           </w:rPr>
-          <w:instrText xml:space="preserve"> PAGEREF _Toc308526317 \h </w:instrText>
+          <w:instrText xml:space="preserve"> PAGEREF _Toc218496170 \h </w:instrText>
         </w:r>
         <w:r>
           <w:rPr>
@@ -374,11 +372,13 @@
           <w:rFonts w:eastAsiaTheme="minorEastAsia" w:cstheme="minorBidi"/>
           <w:smallCaps w:val="0"/>
           <w:noProof/>
-          <w:sz w:val="22"/>
-          <w:szCs w:val="22"/>
+          <w:kern w:val="2"/>
+          <w:sz w:val="24"/>
+          <w:szCs w:val="24"/>
+          <w14:ligatures w14:val="standardContextual"/>
         </w:rPr>
       </w:pPr>
-      <w:hyperlink w:anchor="_Toc308526318" w:history="1">
+      <w:hyperlink w:anchor="_Toc218496171" w:history="1">
         <w:r>
           <w:rPr>
             <w:rStyle w:val="Lienhypertexte"/>
@@ -391,8 +391,10 @@
             <w:rFonts w:eastAsiaTheme="minorEastAsia" w:cstheme="minorBidi"/>
             <w:smallCaps w:val="0"/>
             <w:noProof/>
-            <w:sz w:val="22"/>
-            <w:szCs w:val="22"/>
+            <w:kern w:val="2"/>
+            <w:sz w:val="24"/>
+            <w:szCs w:val="24"/>
+            <w14:ligatures w14:val="standardContextual"/>
           </w:rPr>
           <w:tab/>
         </w:r>
@@ -422,7 +424,7 @@
             <w:noProof/>
             <w:webHidden/>
           </w:rPr>
-          <w:instrText xml:space="preserve"> PAGEREF _Toc308526318 \h </w:instrText>
+          <w:instrText xml:space="preserve"> PAGEREF _Toc218496171 \h </w:instrText>
         </w:r>
         <w:r>
           <w:rPr>
@@ -443,1100 +445,6 @@
             <w:webHidden/>
           </w:rPr>
           <w:t>3</w:t>
-        </w:r>
-        <w:r>
-          <w:rPr>
-            <w:noProof/>
-            <w:webHidden/>
-          </w:rPr>
-          <w:fldChar w:fldCharType="end"/>
-        </w:r>
-      </w:hyperlink>
-    </w:p>
-    <w:p>
-      <w:pPr>
-        <w:pStyle w:val="TM2"/>
-        <w:tabs>
-          <w:tab w:val="left" w:pos="800"/>
-          <w:tab w:val="right" w:leader="dot" w:pos="9060"/>
-        </w:tabs>
-        <w:rPr>
-          <w:rFonts w:eastAsiaTheme="minorEastAsia" w:cstheme="minorBidi"/>
-          <w:smallCaps w:val="0"/>
-          <w:noProof/>
-          <w:sz w:val="22"/>
-          <w:szCs w:val="22"/>
-        </w:rPr>
-      </w:pPr>
-      <w:hyperlink w:anchor="_Toc308526319" w:history="1">
-        <w:r>
-          <w:rPr>
-            <w:rStyle w:val="Lienhypertexte"/>
-            <w:noProof/>
-          </w:rPr>
-          <w:t>1.3</w:t>
-        </w:r>
-        <w:r>
-          <w:rPr>
-            <w:rFonts w:eastAsiaTheme="minorEastAsia" w:cstheme="minorBidi"/>
-            <w:smallCaps w:val="0"/>
-            <w:noProof/>
-            <w:sz w:val="22"/>
-            <w:szCs w:val="22"/>
-          </w:rPr>
-          <w:tab/>
-        </w:r>
-        <w:r>
-          <w:rPr>
-            <w:rStyle w:val="Lienhypertexte"/>
-            <w:noProof/>
-          </w:rPr>
-          <w:t>Matériel et logiciels à disposition</w:t>
-        </w:r>
-        <w:r>
-          <w:rPr>
-            <w:noProof/>
-            <w:webHidden/>
-          </w:rPr>
-          <w:tab/>
-        </w:r>
-        <w:r>
-          <w:rPr>
-            <w:noProof/>
-            <w:webHidden/>
-          </w:rPr>
-          <w:fldChar w:fldCharType="begin"/>
-        </w:r>
-        <w:r>
-          <w:rPr>
-            <w:noProof/>
-            <w:webHidden/>
-          </w:rPr>
-          <w:instrText xml:space="preserve"> PAGEREF _Toc308526319 \h </w:instrText>
-        </w:r>
-        <w:r>
-          <w:rPr>
-            <w:noProof/>
-            <w:webHidden/>
-          </w:rPr>
-        </w:r>
-        <w:r>
-          <w:rPr>
-            <w:noProof/>
-            <w:webHidden/>
-          </w:rPr>
-          <w:fldChar w:fldCharType="separate"/>
-        </w:r>
-        <w:r>
-          <w:rPr>
-            <w:noProof/>
-            <w:webHidden/>
-          </w:rPr>
-          <w:t>3</w:t>
-        </w:r>
-        <w:r>
-          <w:rPr>
-            <w:noProof/>
-            <w:webHidden/>
-          </w:rPr>
-          <w:fldChar w:fldCharType="end"/>
-        </w:r>
-      </w:hyperlink>
-    </w:p>
-    <w:p>
-      <w:pPr>
-        <w:pStyle w:val="TM2"/>
-        <w:tabs>
-          <w:tab w:val="left" w:pos="800"/>
-          <w:tab w:val="right" w:leader="dot" w:pos="9060"/>
-        </w:tabs>
-        <w:rPr>
-          <w:rFonts w:eastAsiaTheme="minorEastAsia" w:cstheme="minorBidi"/>
-          <w:smallCaps w:val="0"/>
-          <w:noProof/>
-          <w:sz w:val="22"/>
-          <w:szCs w:val="22"/>
-        </w:rPr>
-      </w:pPr>
-      <w:hyperlink w:anchor="_Toc308526320" w:history="1">
-        <w:r>
-          <w:rPr>
-            <w:rStyle w:val="Lienhypertexte"/>
-            <w:noProof/>
-          </w:rPr>
-          <w:t>1.4</w:t>
-        </w:r>
-        <w:r>
-          <w:rPr>
-            <w:rFonts w:eastAsiaTheme="minorEastAsia" w:cstheme="minorBidi"/>
-            <w:smallCaps w:val="0"/>
-            <w:noProof/>
-            <w:sz w:val="22"/>
-            <w:szCs w:val="22"/>
-          </w:rPr>
-          <w:tab/>
-        </w:r>
-        <w:r>
-          <w:rPr>
-            <w:rStyle w:val="Lienhypertexte"/>
-            <w:noProof/>
-          </w:rPr>
-          <w:t>Prérequis</w:t>
-        </w:r>
-        <w:r>
-          <w:rPr>
-            <w:noProof/>
-            <w:webHidden/>
-          </w:rPr>
-          <w:tab/>
-        </w:r>
-        <w:r>
-          <w:rPr>
-            <w:noProof/>
-            <w:webHidden/>
-          </w:rPr>
-          <w:fldChar w:fldCharType="begin"/>
-        </w:r>
-        <w:r>
-          <w:rPr>
-            <w:noProof/>
-            <w:webHidden/>
-          </w:rPr>
-          <w:instrText xml:space="preserve"> PAGEREF _Toc308526320 \h </w:instrText>
-        </w:r>
-        <w:r>
-          <w:rPr>
-            <w:noProof/>
-            <w:webHidden/>
-          </w:rPr>
-        </w:r>
-        <w:r>
-          <w:rPr>
-            <w:noProof/>
-            <w:webHidden/>
-          </w:rPr>
-          <w:fldChar w:fldCharType="separate"/>
-        </w:r>
-        <w:r>
-          <w:rPr>
-            <w:noProof/>
-            <w:webHidden/>
-          </w:rPr>
-          <w:t>3</w:t>
-        </w:r>
-        <w:r>
-          <w:rPr>
-            <w:noProof/>
-            <w:webHidden/>
-          </w:rPr>
-          <w:fldChar w:fldCharType="end"/>
-        </w:r>
-      </w:hyperlink>
-    </w:p>
-    <w:p>
-      <w:pPr>
-        <w:pStyle w:val="TM2"/>
-        <w:tabs>
-          <w:tab w:val="left" w:pos="800"/>
-          <w:tab w:val="right" w:leader="dot" w:pos="9060"/>
-        </w:tabs>
-        <w:rPr>
-          <w:rFonts w:eastAsiaTheme="minorEastAsia" w:cstheme="minorBidi"/>
-          <w:smallCaps w:val="0"/>
-          <w:noProof/>
-          <w:sz w:val="22"/>
-          <w:szCs w:val="22"/>
-        </w:rPr>
-      </w:pPr>
-      <w:hyperlink w:anchor="_Toc308526321" w:history="1">
-        <w:r>
-          <w:rPr>
-            <w:rStyle w:val="Lienhypertexte"/>
-            <w:noProof/>
-          </w:rPr>
-          <w:t>1.5</w:t>
-        </w:r>
-        <w:r>
-          <w:rPr>
-            <w:rFonts w:eastAsiaTheme="minorEastAsia" w:cstheme="minorBidi"/>
-            <w:smallCaps w:val="0"/>
-            <w:noProof/>
-            <w:sz w:val="22"/>
-            <w:szCs w:val="22"/>
-          </w:rPr>
-          <w:tab/>
-        </w:r>
-        <w:r>
-          <w:rPr>
-            <w:rStyle w:val="Lienhypertexte"/>
-            <w:noProof/>
-          </w:rPr>
-          <w:t>Cahier des charges</w:t>
-        </w:r>
-        <w:r>
-          <w:rPr>
-            <w:noProof/>
-            <w:webHidden/>
-          </w:rPr>
-          <w:tab/>
-        </w:r>
-        <w:r>
-          <w:rPr>
-            <w:noProof/>
-            <w:webHidden/>
-          </w:rPr>
-          <w:fldChar w:fldCharType="begin"/>
-        </w:r>
-        <w:r>
-          <w:rPr>
-            <w:noProof/>
-            <w:webHidden/>
-          </w:rPr>
-          <w:instrText xml:space="preserve"> PAGEREF _Toc308526321 \h </w:instrText>
-        </w:r>
-        <w:r>
-          <w:rPr>
-            <w:noProof/>
-            <w:webHidden/>
-          </w:rPr>
-        </w:r>
-        <w:r>
-          <w:rPr>
-            <w:noProof/>
-            <w:webHidden/>
-          </w:rPr>
-          <w:fldChar w:fldCharType="separate"/>
-        </w:r>
-        <w:r>
-          <w:rPr>
-            <w:noProof/>
-            <w:webHidden/>
-          </w:rPr>
-          <w:t>3</w:t>
-        </w:r>
-        <w:r>
-          <w:rPr>
-            <w:noProof/>
-            <w:webHidden/>
-          </w:rPr>
-          <w:fldChar w:fldCharType="end"/>
-        </w:r>
-      </w:hyperlink>
-    </w:p>
-    <w:p>
-      <w:pPr>
-        <w:pStyle w:val="TM3"/>
-        <w:tabs>
-          <w:tab w:val="left" w:pos="1200"/>
-          <w:tab w:val="right" w:leader="dot" w:pos="9060"/>
-        </w:tabs>
-        <w:rPr>
-          <w:rFonts w:eastAsiaTheme="minorEastAsia" w:cstheme="minorBidi"/>
-          <w:i w:val="0"/>
-          <w:iCs w:val="0"/>
-          <w:noProof/>
-          <w:sz w:val="22"/>
-          <w:szCs w:val="22"/>
-        </w:rPr>
-      </w:pPr>
-      <w:hyperlink w:anchor="_Toc308526322" w:history="1">
-        <w:r>
-          <w:rPr>
-            <w:rStyle w:val="Lienhypertexte"/>
-            <w:noProof/>
-          </w:rPr>
-          <w:t>1.5.1</w:t>
-        </w:r>
-        <w:r>
-          <w:rPr>
-            <w:rFonts w:eastAsiaTheme="minorEastAsia" w:cstheme="minorBidi"/>
-            <w:i w:val="0"/>
-            <w:iCs w:val="0"/>
-            <w:noProof/>
-            <w:sz w:val="22"/>
-            <w:szCs w:val="22"/>
-          </w:rPr>
-          <w:tab/>
-        </w:r>
-        <w:r>
-          <w:rPr>
-            <w:rStyle w:val="Lienhypertexte"/>
-            <w:noProof/>
-          </w:rPr>
-          <w:t>Objectifs et portée du projet (objectifs SMART)</w:t>
-        </w:r>
-        <w:r>
-          <w:rPr>
-            <w:noProof/>
-            <w:webHidden/>
-          </w:rPr>
-          <w:tab/>
-        </w:r>
-        <w:r>
-          <w:rPr>
-            <w:noProof/>
-            <w:webHidden/>
-          </w:rPr>
-          <w:fldChar w:fldCharType="begin"/>
-        </w:r>
-        <w:r>
-          <w:rPr>
-            <w:noProof/>
-            <w:webHidden/>
-          </w:rPr>
-          <w:instrText xml:space="preserve"> PAGEREF _Toc308526322 \h </w:instrText>
-        </w:r>
-        <w:r>
-          <w:rPr>
-            <w:noProof/>
-            <w:webHidden/>
-          </w:rPr>
-        </w:r>
-        <w:r>
-          <w:rPr>
-            <w:noProof/>
-            <w:webHidden/>
-          </w:rPr>
-          <w:fldChar w:fldCharType="separate"/>
-        </w:r>
-        <w:r>
-          <w:rPr>
-            <w:noProof/>
-            <w:webHidden/>
-          </w:rPr>
-          <w:t>3</w:t>
-        </w:r>
-        <w:r>
-          <w:rPr>
-            <w:noProof/>
-            <w:webHidden/>
-          </w:rPr>
-          <w:fldChar w:fldCharType="end"/>
-        </w:r>
-      </w:hyperlink>
-    </w:p>
-    <w:p>
-      <w:pPr>
-        <w:pStyle w:val="TM3"/>
-        <w:tabs>
-          <w:tab w:val="left" w:pos="1200"/>
-          <w:tab w:val="right" w:leader="dot" w:pos="9060"/>
-        </w:tabs>
-        <w:rPr>
-          <w:rFonts w:eastAsiaTheme="minorEastAsia" w:cstheme="minorBidi"/>
-          <w:i w:val="0"/>
-          <w:iCs w:val="0"/>
-          <w:noProof/>
-          <w:sz w:val="22"/>
-          <w:szCs w:val="22"/>
-        </w:rPr>
-      </w:pPr>
-      <w:hyperlink w:anchor="_Toc308526323" w:history="1">
-        <w:r>
-          <w:rPr>
-            <w:rStyle w:val="Lienhypertexte"/>
-            <w:noProof/>
-          </w:rPr>
-          <w:t>1.5.2</w:t>
-        </w:r>
-        <w:r>
-          <w:rPr>
-            <w:rFonts w:eastAsiaTheme="minorEastAsia" w:cstheme="minorBidi"/>
-            <w:i w:val="0"/>
-            <w:iCs w:val="0"/>
-            <w:noProof/>
-            <w:sz w:val="22"/>
-            <w:szCs w:val="22"/>
-          </w:rPr>
-          <w:tab/>
-        </w:r>
-        <w:r>
-          <w:rPr>
-            <w:rStyle w:val="Lienhypertexte"/>
-            <w:noProof/>
-          </w:rPr>
-          <w:t>Caractéristiques des utilisateurs et impacts</w:t>
-        </w:r>
-        <w:r>
-          <w:rPr>
-            <w:noProof/>
-            <w:webHidden/>
-          </w:rPr>
-          <w:tab/>
-        </w:r>
-        <w:r>
-          <w:rPr>
-            <w:noProof/>
-            <w:webHidden/>
-          </w:rPr>
-          <w:fldChar w:fldCharType="begin"/>
-        </w:r>
-        <w:r>
-          <w:rPr>
-            <w:noProof/>
-            <w:webHidden/>
-          </w:rPr>
-          <w:instrText xml:space="preserve"> PAGEREF _Toc308526323 \h </w:instrText>
-        </w:r>
-        <w:r>
-          <w:rPr>
-            <w:noProof/>
-            <w:webHidden/>
-          </w:rPr>
-        </w:r>
-        <w:r>
-          <w:rPr>
-            <w:noProof/>
-            <w:webHidden/>
-          </w:rPr>
-          <w:fldChar w:fldCharType="separate"/>
-        </w:r>
-        <w:r>
-          <w:rPr>
-            <w:noProof/>
-            <w:webHidden/>
-          </w:rPr>
-          <w:t>3</w:t>
-        </w:r>
-        <w:r>
-          <w:rPr>
-            <w:noProof/>
-            <w:webHidden/>
-          </w:rPr>
-          <w:fldChar w:fldCharType="end"/>
-        </w:r>
-      </w:hyperlink>
-    </w:p>
-    <w:p>
-      <w:pPr>
-        <w:pStyle w:val="TM3"/>
-        <w:tabs>
-          <w:tab w:val="left" w:pos="1200"/>
-          <w:tab w:val="right" w:leader="dot" w:pos="9060"/>
-        </w:tabs>
-        <w:rPr>
-          <w:rFonts w:eastAsiaTheme="minorEastAsia" w:cstheme="minorBidi"/>
-          <w:i w:val="0"/>
-          <w:iCs w:val="0"/>
-          <w:noProof/>
-          <w:sz w:val="22"/>
-          <w:szCs w:val="22"/>
-        </w:rPr>
-      </w:pPr>
-      <w:hyperlink w:anchor="_Toc308526324" w:history="1">
-        <w:r>
-          <w:rPr>
-            <w:rStyle w:val="Lienhypertexte"/>
-            <w:noProof/>
-          </w:rPr>
-          <w:t>1.5.3</w:t>
-        </w:r>
-        <w:r>
-          <w:rPr>
-            <w:rFonts w:eastAsiaTheme="minorEastAsia" w:cstheme="minorBidi"/>
-            <w:i w:val="0"/>
-            <w:iCs w:val="0"/>
-            <w:noProof/>
-            <w:sz w:val="22"/>
-            <w:szCs w:val="22"/>
-          </w:rPr>
-          <w:tab/>
-        </w:r>
-        <w:r>
-          <w:rPr>
-            <w:rStyle w:val="Lienhypertexte"/>
-            <w:noProof/>
-          </w:rPr>
-          <w:t>Fonctionnalités requises (du point de vue de l’utilisateur)</w:t>
-        </w:r>
-        <w:r>
-          <w:rPr>
-            <w:noProof/>
-            <w:webHidden/>
-          </w:rPr>
-          <w:tab/>
-        </w:r>
-        <w:r>
-          <w:rPr>
-            <w:noProof/>
-            <w:webHidden/>
-          </w:rPr>
-          <w:fldChar w:fldCharType="begin"/>
-        </w:r>
-        <w:r>
-          <w:rPr>
-            <w:noProof/>
-            <w:webHidden/>
-          </w:rPr>
-          <w:instrText xml:space="preserve"> PAGEREF _Toc308526324 \h </w:instrText>
-        </w:r>
-        <w:r>
-          <w:rPr>
-            <w:noProof/>
-            <w:webHidden/>
-          </w:rPr>
-        </w:r>
-        <w:r>
-          <w:rPr>
-            <w:noProof/>
-            <w:webHidden/>
-          </w:rPr>
-          <w:fldChar w:fldCharType="separate"/>
-        </w:r>
-        <w:r>
-          <w:rPr>
-            <w:noProof/>
-            <w:webHidden/>
-          </w:rPr>
-          <w:t>3</w:t>
-        </w:r>
-        <w:r>
-          <w:rPr>
-            <w:noProof/>
-            <w:webHidden/>
-          </w:rPr>
-          <w:fldChar w:fldCharType="end"/>
-        </w:r>
-      </w:hyperlink>
-    </w:p>
-    <w:p>
-      <w:pPr>
-        <w:pStyle w:val="TM3"/>
-        <w:tabs>
-          <w:tab w:val="left" w:pos="1200"/>
-          <w:tab w:val="right" w:leader="dot" w:pos="9060"/>
-        </w:tabs>
-        <w:rPr>
-          <w:rFonts w:eastAsiaTheme="minorEastAsia" w:cstheme="minorBidi"/>
-          <w:i w:val="0"/>
-          <w:iCs w:val="0"/>
-          <w:noProof/>
-          <w:sz w:val="22"/>
-          <w:szCs w:val="22"/>
-        </w:rPr>
-      </w:pPr>
-      <w:hyperlink w:anchor="_Toc308526325" w:history="1">
-        <w:r>
-          <w:rPr>
-            <w:rStyle w:val="Lienhypertexte"/>
-            <w:noProof/>
-          </w:rPr>
-          <w:t>1.5.4</w:t>
-        </w:r>
-        <w:r>
-          <w:rPr>
-            <w:rFonts w:eastAsiaTheme="minorEastAsia" w:cstheme="minorBidi"/>
-            <w:i w:val="0"/>
-            <w:iCs w:val="0"/>
-            <w:noProof/>
-            <w:sz w:val="22"/>
-            <w:szCs w:val="22"/>
-          </w:rPr>
-          <w:tab/>
-        </w:r>
-        <w:r>
-          <w:rPr>
-            <w:rStyle w:val="Lienhypertexte"/>
-            <w:noProof/>
-          </w:rPr>
-          <w:t>Contraintes</w:t>
-        </w:r>
-        <w:r>
-          <w:rPr>
-            <w:noProof/>
-            <w:webHidden/>
-          </w:rPr>
-          <w:tab/>
-        </w:r>
-        <w:r>
-          <w:rPr>
-            <w:noProof/>
-            <w:webHidden/>
-          </w:rPr>
-          <w:fldChar w:fldCharType="begin"/>
-        </w:r>
-        <w:r>
-          <w:rPr>
-            <w:noProof/>
-            <w:webHidden/>
-          </w:rPr>
-          <w:instrText xml:space="preserve"> PAGEREF _Toc308526325 \h </w:instrText>
-        </w:r>
-        <w:r>
-          <w:rPr>
-            <w:noProof/>
-            <w:webHidden/>
-          </w:rPr>
-        </w:r>
-        <w:r>
-          <w:rPr>
-            <w:noProof/>
-            <w:webHidden/>
-          </w:rPr>
-          <w:fldChar w:fldCharType="separate"/>
-        </w:r>
-        <w:r>
-          <w:rPr>
-            <w:noProof/>
-            <w:webHidden/>
-          </w:rPr>
-          <w:t>3</w:t>
-        </w:r>
-        <w:r>
-          <w:rPr>
-            <w:noProof/>
-            <w:webHidden/>
-          </w:rPr>
-          <w:fldChar w:fldCharType="end"/>
-        </w:r>
-      </w:hyperlink>
-    </w:p>
-    <w:p>
-      <w:pPr>
-        <w:pStyle w:val="TM3"/>
-        <w:tabs>
-          <w:tab w:val="left" w:pos="1200"/>
-          <w:tab w:val="right" w:leader="dot" w:pos="9060"/>
-        </w:tabs>
-        <w:rPr>
-          <w:rFonts w:eastAsiaTheme="minorEastAsia" w:cstheme="minorBidi"/>
-          <w:i w:val="0"/>
-          <w:iCs w:val="0"/>
-          <w:noProof/>
-          <w:sz w:val="22"/>
-          <w:szCs w:val="22"/>
-        </w:rPr>
-      </w:pPr>
-      <w:hyperlink w:anchor="_Toc308526326" w:history="1">
-        <w:r>
-          <w:rPr>
-            <w:rStyle w:val="Lienhypertexte"/>
-            <w:noProof/>
-          </w:rPr>
-          <w:t>1.5.5</w:t>
-        </w:r>
-        <w:r>
-          <w:rPr>
-            <w:rFonts w:eastAsiaTheme="minorEastAsia" w:cstheme="minorBidi"/>
-            <w:i w:val="0"/>
-            <w:iCs w:val="0"/>
-            <w:noProof/>
-            <w:sz w:val="22"/>
-            <w:szCs w:val="22"/>
-          </w:rPr>
-          <w:tab/>
-        </w:r>
-        <w:r>
-          <w:rPr>
-            <w:rStyle w:val="Lienhypertexte"/>
-            <w:noProof/>
-          </w:rPr>
-          <w:t>Travail à réaliser par l'apprenti</w:t>
-        </w:r>
-        <w:r>
-          <w:rPr>
-            <w:noProof/>
-            <w:webHidden/>
-          </w:rPr>
-          <w:tab/>
-        </w:r>
-        <w:r>
-          <w:rPr>
-            <w:noProof/>
-            <w:webHidden/>
-          </w:rPr>
-          <w:fldChar w:fldCharType="begin"/>
-        </w:r>
-        <w:r>
-          <w:rPr>
-            <w:noProof/>
-            <w:webHidden/>
-          </w:rPr>
-          <w:instrText xml:space="preserve"> PAGEREF _Toc308526326 \h </w:instrText>
-        </w:r>
-        <w:r>
-          <w:rPr>
-            <w:noProof/>
-            <w:webHidden/>
-          </w:rPr>
-        </w:r>
-        <w:r>
-          <w:rPr>
-            <w:noProof/>
-            <w:webHidden/>
-          </w:rPr>
-          <w:fldChar w:fldCharType="separate"/>
-        </w:r>
-        <w:r>
-          <w:rPr>
-            <w:noProof/>
-            <w:webHidden/>
-          </w:rPr>
-          <w:t>4</w:t>
-        </w:r>
-        <w:r>
-          <w:rPr>
-            <w:noProof/>
-            <w:webHidden/>
-          </w:rPr>
-          <w:fldChar w:fldCharType="end"/>
-        </w:r>
-      </w:hyperlink>
-    </w:p>
-    <w:p>
-      <w:pPr>
-        <w:pStyle w:val="TM3"/>
-        <w:tabs>
-          <w:tab w:val="left" w:pos="1200"/>
-          <w:tab w:val="right" w:leader="dot" w:pos="9060"/>
-        </w:tabs>
-        <w:rPr>
-          <w:rFonts w:eastAsiaTheme="minorEastAsia" w:cstheme="minorBidi"/>
-          <w:i w:val="0"/>
-          <w:iCs w:val="0"/>
-          <w:noProof/>
-          <w:sz w:val="22"/>
-          <w:szCs w:val="22"/>
-        </w:rPr>
-      </w:pPr>
-      <w:hyperlink w:anchor="_Toc308526327" w:history="1">
-        <w:r>
-          <w:rPr>
-            <w:rStyle w:val="Lienhypertexte"/>
-            <w:noProof/>
-          </w:rPr>
-          <w:t>1.5.6</w:t>
-        </w:r>
-        <w:r>
-          <w:rPr>
-            <w:rFonts w:eastAsiaTheme="minorEastAsia" w:cstheme="minorBidi"/>
-            <w:i w:val="0"/>
-            <w:iCs w:val="0"/>
-            <w:noProof/>
-            <w:sz w:val="22"/>
-            <w:szCs w:val="22"/>
-          </w:rPr>
-          <w:tab/>
-        </w:r>
-        <w:r>
-          <w:rPr>
-            <w:rStyle w:val="Lienhypertexte"/>
-            <w:noProof/>
-          </w:rPr>
-          <w:t>Si le temps le permet …</w:t>
-        </w:r>
-        <w:r>
-          <w:rPr>
-            <w:noProof/>
-            <w:webHidden/>
-          </w:rPr>
-          <w:tab/>
-        </w:r>
-        <w:r>
-          <w:rPr>
-            <w:noProof/>
-            <w:webHidden/>
-          </w:rPr>
-          <w:fldChar w:fldCharType="begin"/>
-        </w:r>
-        <w:r>
-          <w:rPr>
-            <w:noProof/>
-            <w:webHidden/>
-          </w:rPr>
-          <w:instrText xml:space="preserve"> PAGEREF _Toc308526327 \h </w:instrText>
-        </w:r>
-        <w:r>
-          <w:rPr>
-            <w:noProof/>
-            <w:webHidden/>
-          </w:rPr>
-        </w:r>
-        <w:r>
-          <w:rPr>
-            <w:noProof/>
-            <w:webHidden/>
-          </w:rPr>
-          <w:fldChar w:fldCharType="separate"/>
-        </w:r>
-        <w:r>
-          <w:rPr>
-            <w:noProof/>
-            <w:webHidden/>
-          </w:rPr>
-          <w:t>4</w:t>
-        </w:r>
-        <w:r>
-          <w:rPr>
-            <w:noProof/>
-            <w:webHidden/>
-          </w:rPr>
-          <w:fldChar w:fldCharType="end"/>
-        </w:r>
-      </w:hyperlink>
-    </w:p>
-    <w:p>
-      <w:pPr>
-        <w:pStyle w:val="TM3"/>
-        <w:tabs>
-          <w:tab w:val="left" w:pos="1200"/>
-          <w:tab w:val="right" w:leader="dot" w:pos="9060"/>
-        </w:tabs>
-        <w:rPr>
-          <w:rFonts w:eastAsiaTheme="minorEastAsia" w:cstheme="minorBidi"/>
-          <w:i w:val="0"/>
-          <w:iCs w:val="0"/>
-          <w:noProof/>
-          <w:sz w:val="22"/>
-          <w:szCs w:val="22"/>
-        </w:rPr>
-      </w:pPr>
-      <w:hyperlink w:anchor="_Toc308526328" w:history="1">
-        <w:r>
-          <w:rPr>
-            <w:rStyle w:val="Lienhypertexte"/>
-            <w:noProof/>
-          </w:rPr>
-          <w:t>1.5.7</w:t>
-        </w:r>
-        <w:r>
-          <w:rPr>
-            <w:rFonts w:eastAsiaTheme="minorEastAsia" w:cstheme="minorBidi"/>
-            <w:i w:val="0"/>
-            <w:iCs w:val="0"/>
-            <w:noProof/>
-            <w:sz w:val="22"/>
-            <w:szCs w:val="22"/>
-          </w:rPr>
-          <w:tab/>
-        </w:r>
-        <w:r>
-          <w:rPr>
-            <w:rStyle w:val="Lienhypertexte"/>
-            <w:noProof/>
-          </w:rPr>
-          <w:t>Méthodes de validation des solutions</w:t>
-        </w:r>
-        <w:r>
-          <w:rPr>
-            <w:noProof/>
-            <w:webHidden/>
-          </w:rPr>
-          <w:tab/>
-        </w:r>
-        <w:r>
-          <w:rPr>
-            <w:noProof/>
-            <w:webHidden/>
-          </w:rPr>
-          <w:fldChar w:fldCharType="begin"/>
-        </w:r>
-        <w:r>
-          <w:rPr>
-            <w:noProof/>
-            <w:webHidden/>
-          </w:rPr>
-          <w:instrText xml:space="preserve"> PAGEREF _Toc308526328 \h </w:instrText>
-        </w:r>
-        <w:r>
-          <w:rPr>
-            <w:noProof/>
-            <w:webHidden/>
-          </w:rPr>
-        </w:r>
-        <w:r>
-          <w:rPr>
-            <w:noProof/>
-            <w:webHidden/>
-          </w:rPr>
-          <w:fldChar w:fldCharType="separate"/>
-        </w:r>
-        <w:r>
-          <w:rPr>
-            <w:noProof/>
-            <w:webHidden/>
-          </w:rPr>
-          <w:t>4</w:t>
-        </w:r>
-        <w:r>
-          <w:rPr>
-            <w:noProof/>
-            <w:webHidden/>
-          </w:rPr>
-          <w:fldChar w:fldCharType="end"/>
-        </w:r>
-      </w:hyperlink>
-    </w:p>
-    <w:p>
-      <w:pPr>
-        <w:pStyle w:val="TM2"/>
-        <w:tabs>
-          <w:tab w:val="left" w:pos="800"/>
-          <w:tab w:val="right" w:leader="dot" w:pos="9060"/>
-        </w:tabs>
-        <w:rPr>
-          <w:rFonts w:eastAsiaTheme="minorEastAsia" w:cstheme="minorBidi"/>
-          <w:smallCaps w:val="0"/>
-          <w:noProof/>
-          <w:sz w:val="22"/>
-          <w:szCs w:val="22"/>
-        </w:rPr>
-      </w:pPr>
-      <w:hyperlink w:anchor="_Toc308526329" w:history="1">
-        <w:r>
-          <w:rPr>
-            <w:rStyle w:val="Lienhypertexte"/>
-            <w:noProof/>
-          </w:rPr>
-          <w:t>1.6</w:t>
-        </w:r>
-        <w:r>
-          <w:rPr>
-            <w:rFonts w:eastAsiaTheme="minorEastAsia" w:cstheme="minorBidi"/>
-            <w:smallCaps w:val="0"/>
-            <w:noProof/>
-            <w:sz w:val="22"/>
-            <w:szCs w:val="22"/>
-          </w:rPr>
-          <w:tab/>
-        </w:r>
-        <w:r>
-          <w:rPr>
-            <w:rStyle w:val="Lienhypertexte"/>
-            <w:noProof/>
-          </w:rPr>
-          <w:t>Les points suivants seront évalués</w:t>
-        </w:r>
-        <w:r>
-          <w:rPr>
-            <w:noProof/>
-            <w:webHidden/>
-          </w:rPr>
-          <w:tab/>
-        </w:r>
-        <w:r>
-          <w:rPr>
-            <w:noProof/>
-            <w:webHidden/>
-          </w:rPr>
-          <w:fldChar w:fldCharType="begin"/>
-        </w:r>
-        <w:r>
-          <w:rPr>
-            <w:noProof/>
-            <w:webHidden/>
-          </w:rPr>
-          <w:instrText xml:space="preserve"> PAGEREF _Toc308526329 \h </w:instrText>
-        </w:r>
-        <w:r>
-          <w:rPr>
-            <w:noProof/>
-            <w:webHidden/>
-          </w:rPr>
-        </w:r>
-        <w:r>
-          <w:rPr>
-            <w:noProof/>
-            <w:webHidden/>
-          </w:rPr>
-          <w:fldChar w:fldCharType="separate"/>
-        </w:r>
-        <w:r>
-          <w:rPr>
-            <w:noProof/>
-            <w:webHidden/>
-          </w:rPr>
-          <w:t>4</w:t>
-        </w:r>
-        <w:r>
-          <w:rPr>
-            <w:noProof/>
-            <w:webHidden/>
-          </w:rPr>
-          <w:fldChar w:fldCharType="end"/>
-        </w:r>
-      </w:hyperlink>
-    </w:p>
-    <w:p>
-      <w:pPr>
-        <w:pStyle w:val="TM2"/>
-        <w:tabs>
-          <w:tab w:val="left" w:pos="800"/>
-          <w:tab w:val="right" w:leader="dot" w:pos="9060"/>
-        </w:tabs>
-        <w:rPr>
-          <w:rFonts w:eastAsiaTheme="minorEastAsia" w:cstheme="minorBidi"/>
-          <w:smallCaps w:val="0"/>
-          <w:noProof/>
-          <w:sz w:val="22"/>
-          <w:szCs w:val="22"/>
-        </w:rPr>
-      </w:pPr>
-      <w:hyperlink w:anchor="_Toc308526330" w:history="1">
-        <w:r>
-          <w:rPr>
-            <w:rStyle w:val="Lienhypertexte"/>
-            <w:noProof/>
-          </w:rPr>
-          <w:t>1.7</w:t>
-        </w:r>
-        <w:r>
-          <w:rPr>
-            <w:rFonts w:eastAsiaTheme="minorEastAsia" w:cstheme="minorBidi"/>
-            <w:smallCaps w:val="0"/>
-            <w:noProof/>
-            <w:sz w:val="22"/>
-            <w:szCs w:val="22"/>
-          </w:rPr>
-          <w:tab/>
-        </w:r>
-        <w:r>
-          <w:rPr>
-            <w:rStyle w:val="Lienhypertexte"/>
-            <w:noProof/>
-          </w:rPr>
-          <w:t>Validation et conditions de réussite</w:t>
-        </w:r>
-        <w:r>
-          <w:rPr>
-            <w:noProof/>
-            <w:webHidden/>
-          </w:rPr>
-          <w:tab/>
-        </w:r>
-        <w:r>
-          <w:rPr>
-            <w:noProof/>
-            <w:webHidden/>
-          </w:rPr>
-          <w:fldChar w:fldCharType="begin"/>
-        </w:r>
-        <w:r>
-          <w:rPr>
-            <w:noProof/>
-            <w:webHidden/>
-          </w:rPr>
-          <w:instrText xml:space="preserve"> PAGEREF _Toc308526330 \h </w:instrText>
-        </w:r>
-        <w:r>
-          <w:rPr>
-            <w:noProof/>
-            <w:webHidden/>
-          </w:rPr>
-        </w:r>
-        <w:r>
-          <w:rPr>
-            <w:noProof/>
-            <w:webHidden/>
-          </w:rPr>
-          <w:fldChar w:fldCharType="separate"/>
-        </w:r>
-        <w:r>
-          <w:rPr>
-            <w:noProof/>
-            <w:webHidden/>
-          </w:rPr>
-          <w:t>4</w:t>
         </w:r>
         <w:r>
           <w:rPr>
@@ -1560,11 +468,13 @@
           <w:bCs w:val="0"/>
           <w:caps w:val="0"/>
           <w:noProof/>
-          <w:sz w:val="22"/>
-          <w:szCs w:val="22"/>
+          <w:kern w:val="2"/>
+          <w:sz w:val="24"/>
+          <w:szCs w:val="24"/>
+          <w14:ligatures w14:val="standardContextual"/>
         </w:rPr>
       </w:pPr>
-      <w:hyperlink w:anchor="_Toc308526331" w:history="1">
+      <w:hyperlink w:anchor="_Toc218496172" w:history="1">
         <w:r>
           <w:rPr>
             <w:rStyle w:val="Lienhypertexte"/>
@@ -1579,8 +489,10 @@
             <w:bCs w:val="0"/>
             <w:caps w:val="0"/>
             <w:noProof/>
-            <w:sz w:val="22"/>
-            <w:szCs w:val="22"/>
+            <w:kern w:val="2"/>
+            <w:sz w:val="24"/>
+            <w:szCs w:val="24"/>
+            <w14:ligatures w14:val="standardContextual"/>
           </w:rPr>
           <w:tab/>
         </w:r>
@@ -1589,7 +501,7 @@
             <w:rStyle w:val="Lienhypertexte"/>
             <w:noProof/>
           </w:rPr>
-          <w:t>Planification Initiale</w:t>
+          <w:t>Réalisation</w:t>
         </w:r>
         <w:r>
           <w:rPr>
@@ -1610,7 +522,571 @@
             <w:noProof/>
             <w:webHidden/>
           </w:rPr>
-          <w:instrText xml:space="preserve"> PAGEREF _Toc308526331 \h </w:instrText>
+          <w:instrText xml:space="preserve"> PAGEREF _Toc218496172 \h </w:instrText>
+        </w:r>
+        <w:r>
+          <w:rPr>
+            <w:noProof/>
+            <w:webHidden/>
+          </w:rPr>
+        </w:r>
+        <w:r>
+          <w:rPr>
+            <w:noProof/>
+            <w:webHidden/>
+          </w:rPr>
+          <w:fldChar w:fldCharType="separate"/>
+        </w:r>
+        <w:r>
+          <w:rPr>
+            <w:noProof/>
+            <w:webHidden/>
+          </w:rPr>
+          <w:t>3</w:t>
+        </w:r>
+        <w:r>
+          <w:rPr>
+            <w:noProof/>
+            <w:webHidden/>
+          </w:rPr>
+          <w:fldChar w:fldCharType="end"/>
+        </w:r>
+      </w:hyperlink>
+    </w:p>
+    <w:p>
+      <w:pPr>
+        <w:pStyle w:val="TM2"/>
+        <w:tabs>
+          <w:tab w:val="left" w:pos="800"/>
+          <w:tab w:val="right" w:leader="dot" w:pos="9060"/>
+        </w:tabs>
+        <w:rPr>
+          <w:rFonts w:eastAsiaTheme="minorEastAsia" w:cstheme="minorBidi"/>
+          <w:smallCaps w:val="0"/>
+          <w:noProof/>
+          <w:kern w:val="2"/>
+          <w:sz w:val="24"/>
+          <w:szCs w:val="24"/>
+          <w14:ligatures w14:val="standardContextual"/>
+        </w:rPr>
+      </w:pPr>
+      <w:hyperlink w:anchor="_Toc218496173" w:history="1">
+        <w:r>
+          <w:rPr>
+            <w:rStyle w:val="Lienhypertexte"/>
+            <w:noProof/>
+          </w:rPr>
+          <w:t>2.1</w:t>
+        </w:r>
+        <w:r>
+          <w:rPr>
+            <w:rFonts w:eastAsiaTheme="minorEastAsia" w:cstheme="minorBidi"/>
+            <w:smallCaps w:val="0"/>
+            <w:noProof/>
+            <w:kern w:val="2"/>
+            <w:sz w:val="24"/>
+            <w:szCs w:val="24"/>
+            <w14:ligatures w14:val="standardContextual"/>
+          </w:rPr>
+          <w:tab/>
+        </w:r>
+        <w:r>
+          <w:rPr>
+            <w:rStyle w:val="Lienhypertexte"/>
+            <w:noProof/>
+          </w:rPr>
+          <w:t>Problèmes rencontrés</w:t>
+        </w:r>
+        <w:r>
+          <w:rPr>
+            <w:noProof/>
+            <w:webHidden/>
+          </w:rPr>
+          <w:tab/>
+        </w:r>
+        <w:r>
+          <w:rPr>
+            <w:noProof/>
+            <w:webHidden/>
+          </w:rPr>
+          <w:fldChar w:fldCharType="begin"/>
+        </w:r>
+        <w:r>
+          <w:rPr>
+            <w:noProof/>
+            <w:webHidden/>
+          </w:rPr>
+          <w:instrText xml:space="preserve"> PAGEREF _Toc218496173 \h </w:instrText>
+        </w:r>
+        <w:r>
+          <w:rPr>
+            <w:noProof/>
+            <w:webHidden/>
+          </w:rPr>
+        </w:r>
+        <w:r>
+          <w:rPr>
+            <w:noProof/>
+            <w:webHidden/>
+          </w:rPr>
+          <w:fldChar w:fldCharType="separate"/>
+        </w:r>
+        <w:r>
+          <w:rPr>
+            <w:noProof/>
+            <w:webHidden/>
+          </w:rPr>
+          <w:t>3</w:t>
+        </w:r>
+        <w:r>
+          <w:rPr>
+            <w:noProof/>
+            <w:webHidden/>
+          </w:rPr>
+          <w:fldChar w:fldCharType="end"/>
+        </w:r>
+      </w:hyperlink>
+    </w:p>
+    <w:p>
+      <w:pPr>
+        <w:pStyle w:val="TM2"/>
+        <w:tabs>
+          <w:tab w:val="left" w:pos="800"/>
+          <w:tab w:val="right" w:leader="dot" w:pos="9060"/>
+        </w:tabs>
+        <w:rPr>
+          <w:rFonts w:eastAsiaTheme="minorEastAsia" w:cstheme="minorBidi"/>
+          <w:smallCaps w:val="0"/>
+          <w:noProof/>
+          <w:kern w:val="2"/>
+          <w:sz w:val="24"/>
+          <w:szCs w:val="24"/>
+          <w14:ligatures w14:val="standardContextual"/>
+        </w:rPr>
+      </w:pPr>
+      <w:hyperlink w:anchor="_Toc218496174" w:history="1">
+        <w:r>
+          <w:rPr>
+            <w:rStyle w:val="Lienhypertexte"/>
+            <w:noProof/>
+          </w:rPr>
+          <w:t>2.2</w:t>
+        </w:r>
+        <w:r>
+          <w:rPr>
+            <w:rFonts w:eastAsiaTheme="minorEastAsia" w:cstheme="minorBidi"/>
+            <w:smallCaps w:val="0"/>
+            <w:noProof/>
+            <w:kern w:val="2"/>
+            <w:sz w:val="24"/>
+            <w:szCs w:val="24"/>
+            <w14:ligatures w14:val="standardContextual"/>
+          </w:rPr>
+          <w:tab/>
+        </w:r>
+        <w:r>
+          <w:rPr>
+            <w:rStyle w:val="Lienhypertexte"/>
+            <w:noProof/>
+          </w:rPr>
+          <w:t>Connaissances acquises</w:t>
+        </w:r>
+        <w:r>
+          <w:rPr>
+            <w:noProof/>
+            <w:webHidden/>
+          </w:rPr>
+          <w:tab/>
+        </w:r>
+        <w:r>
+          <w:rPr>
+            <w:noProof/>
+            <w:webHidden/>
+          </w:rPr>
+          <w:fldChar w:fldCharType="begin"/>
+        </w:r>
+        <w:r>
+          <w:rPr>
+            <w:noProof/>
+            <w:webHidden/>
+          </w:rPr>
+          <w:instrText xml:space="preserve"> PAGEREF _Toc218496174 \h </w:instrText>
+        </w:r>
+        <w:r>
+          <w:rPr>
+            <w:noProof/>
+            <w:webHidden/>
+          </w:rPr>
+        </w:r>
+        <w:r>
+          <w:rPr>
+            <w:noProof/>
+            <w:webHidden/>
+          </w:rPr>
+          <w:fldChar w:fldCharType="separate"/>
+        </w:r>
+        <w:r>
+          <w:rPr>
+            <w:noProof/>
+            <w:webHidden/>
+          </w:rPr>
+          <w:t>3</w:t>
+        </w:r>
+        <w:r>
+          <w:rPr>
+            <w:noProof/>
+            <w:webHidden/>
+          </w:rPr>
+          <w:fldChar w:fldCharType="end"/>
+        </w:r>
+      </w:hyperlink>
+    </w:p>
+    <w:p>
+      <w:pPr>
+        <w:pStyle w:val="TM2"/>
+        <w:tabs>
+          <w:tab w:val="left" w:pos="800"/>
+          <w:tab w:val="right" w:leader="dot" w:pos="9060"/>
+        </w:tabs>
+        <w:rPr>
+          <w:rFonts w:eastAsiaTheme="minorEastAsia" w:cstheme="minorBidi"/>
+          <w:smallCaps w:val="0"/>
+          <w:noProof/>
+          <w:kern w:val="2"/>
+          <w:sz w:val="24"/>
+          <w:szCs w:val="24"/>
+          <w14:ligatures w14:val="standardContextual"/>
+        </w:rPr>
+      </w:pPr>
+      <w:hyperlink w:anchor="_Toc218496175" w:history="1">
+        <w:r>
+          <w:rPr>
+            <w:rStyle w:val="Lienhypertexte"/>
+            <w:noProof/>
+          </w:rPr>
+          <w:t>2.3</w:t>
+        </w:r>
+        <w:r>
+          <w:rPr>
+            <w:rFonts w:eastAsiaTheme="minorEastAsia" w:cstheme="minorBidi"/>
+            <w:smallCaps w:val="0"/>
+            <w:noProof/>
+            <w:kern w:val="2"/>
+            <w:sz w:val="24"/>
+            <w:szCs w:val="24"/>
+            <w14:ligatures w14:val="standardContextual"/>
+          </w:rPr>
+          <w:tab/>
+        </w:r>
+        <w:r>
+          <w:rPr>
+            <w:rStyle w:val="Lienhypertexte"/>
+            <w:noProof/>
+          </w:rPr>
+          <w:t>Répartition des tâches</w:t>
+        </w:r>
+        <w:r>
+          <w:rPr>
+            <w:noProof/>
+            <w:webHidden/>
+          </w:rPr>
+          <w:tab/>
+        </w:r>
+        <w:r>
+          <w:rPr>
+            <w:noProof/>
+            <w:webHidden/>
+          </w:rPr>
+          <w:fldChar w:fldCharType="begin"/>
+        </w:r>
+        <w:r>
+          <w:rPr>
+            <w:noProof/>
+            <w:webHidden/>
+          </w:rPr>
+          <w:instrText xml:space="preserve"> PAGEREF _Toc218496175 \h </w:instrText>
+        </w:r>
+        <w:r>
+          <w:rPr>
+            <w:noProof/>
+            <w:webHidden/>
+          </w:rPr>
+        </w:r>
+        <w:r>
+          <w:rPr>
+            <w:noProof/>
+            <w:webHidden/>
+          </w:rPr>
+          <w:fldChar w:fldCharType="separate"/>
+        </w:r>
+        <w:r>
+          <w:rPr>
+            <w:noProof/>
+            <w:webHidden/>
+          </w:rPr>
+          <w:t>3</w:t>
+        </w:r>
+        <w:r>
+          <w:rPr>
+            <w:noProof/>
+            <w:webHidden/>
+          </w:rPr>
+          <w:fldChar w:fldCharType="end"/>
+        </w:r>
+      </w:hyperlink>
+    </w:p>
+    <w:p>
+      <w:pPr>
+        <w:pStyle w:val="TM2"/>
+        <w:tabs>
+          <w:tab w:val="left" w:pos="800"/>
+          <w:tab w:val="right" w:leader="dot" w:pos="9060"/>
+        </w:tabs>
+        <w:rPr>
+          <w:rFonts w:eastAsiaTheme="minorEastAsia" w:cstheme="minorBidi"/>
+          <w:smallCaps w:val="0"/>
+          <w:noProof/>
+          <w:kern w:val="2"/>
+          <w:sz w:val="24"/>
+          <w:szCs w:val="24"/>
+          <w14:ligatures w14:val="standardContextual"/>
+        </w:rPr>
+      </w:pPr>
+      <w:hyperlink w:anchor="_Toc218496176" w:history="1">
+        <w:r>
+          <w:rPr>
+            <w:rStyle w:val="Lienhypertexte"/>
+            <w:noProof/>
+          </w:rPr>
+          <w:t>2.4</w:t>
+        </w:r>
+        <w:r>
+          <w:rPr>
+            <w:rFonts w:eastAsiaTheme="minorEastAsia" w:cstheme="minorBidi"/>
+            <w:smallCaps w:val="0"/>
+            <w:noProof/>
+            <w:kern w:val="2"/>
+            <w:sz w:val="24"/>
+            <w:szCs w:val="24"/>
+            <w14:ligatures w14:val="standardContextual"/>
+          </w:rPr>
+          <w:tab/>
+        </w:r>
+        <w:r>
+          <w:rPr>
+            <w:rStyle w:val="Lienhypertexte"/>
+            <w:noProof/>
+          </w:rPr>
+          <w:t>Comment fonctionne l’authentification MSAL</w:t>
+        </w:r>
+        <w:r>
+          <w:rPr>
+            <w:noProof/>
+            <w:webHidden/>
+          </w:rPr>
+          <w:tab/>
+        </w:r>
+        <w:r>
+          <w:rPr>
+            <w:noProof/>
+            <w:webHidden/>
+          </w:rPr>
+          <w:fldChar w:fldCharType="begin"/>
+        </w:r>
+        <w:r>
+          <w:rPr>
+            <w:noProof/>
+            <w:webHidden/>
+          </w:rPr>
+          <w:instrText xml:space="preserve"> PAGEREF _Toc218496176 \h </w:instrText>
+        </w:r>
+        <w:r>
+          <w:rPr>
+            <w:noProof/>
+            <w:webHidden/>
+          </w:rPr>
+        </w:r>
+        <w:r>
+          <w:rPr>
+            <w:noProof/>
+            <w:webHidden/>
+          </w:rPr>
+          <w:fldChar w:fldCharType="separate"/>
+        </w:r>
+        <w:r>
+          <w:rPr>
+            <w:noProof/>
+            <w:webHidden/>
+          </w:rPr>
+          <w:t>3</w:t>
+        </w:r>
+        <w:r>
+          <w:rPr>
+            <w:noProof/>
+            <w:webHidden/>
+          </w:rPr>
+          <w:fldChar w:fldCharType="end"/>
+        </w:r>
+      </w:hyperlink>
+    </w:p>
+    <w:p>
+      <w:pPr>
+        <w:pStyle w:val="TM2"/>
+        <w:tabs>
+          <w:tab w:val="left" w:pos="800"/>
+          <w:tab w:val="right" w:leader="dot" w:pos="9060"/>
+        </w:tabs>
+        <w:rPr>
+          <w:rFonts w:eastAsiaTheme="minorEastAsia" w:cstheme="minorBidi"/>
+          <w:smallCaps w:val="0"/>
+          <w:noProof/>
+          <w:kern w:val="2"/>
+          <w:sz w:val="24"/>
+          <w:szCs w:val="24"/>
+          <w14:ligatures w14:val="standardContextual"/>
+        </w:rPr>
+      </w:pPr>
+      <w:hyperlink w:anchor="_Toc218496177" w:history="1">
+        <w:r>
+          <w:rPr>
+            <w:rStyle w:val="Lienhypertexte"/>
+            <w:noProof/>
+          </w:rPr>
+          <w:t>2.5</w:t>
+        </w:r>
+        <w:r>
+          <w:rPr>
+            <w:rFonts w:eastAsiaTheme="minorEastAsia" w:cstheme="minorBidi"/>
+            <w:smallCaps w:val="0"/>
+            <w:noProof/>
+            <w:kern w:val="2"/>
+            <w:sz w:val="24"/>
+            <w:szCs w:val="24"/>
+            <w14:ligatures w14:val="standardContextual"/>
+          </w:rPr>
+          <w:tab/>
+        </w:r>
+        <w:r>
+          <w:rPr>
+            <w:rStyle w:val="Lienhypertexte"/>
+            <w:noProof/>
+          </w:rPr>
+          <w:t>Explication .env</w:t>
+        </w:r>
+        <w:r>
+          <w:rPr>
+            <w:noProof/>
+            <w:webHidden/>
+          </w:rPr>
+          <w:tab/>
+        </w:r>
+        <w:r>
+          <w:rPr>
+            <w:noProof/>
+            <w:webHidden/>
+          </w:rPr>
+          <w:fldChar w:fldCharType="begin"/>
+        </w:r>
+        <w:r>
+          <w:rPr>
+            <w:noProof/>
+            <w:webHidden/>
+          </w:rPr>
+          <w:instrText xml:space="preserve"> PAGEREF _Toc218496177 \h </w:instrText>
+        </w:r>
+        <w:r>
+          <w:rPr>
+            <w:noProof/>
+            <w:webHidden/>
+          </w:rPr>
+        </w:r>
+        <w:r>
+          <w:rPr>
+            <w:noProof/>
+            <w:webHidden/>
+          </w:rPr>
+          <w:fldChar w:fldCharType="separate"/>
+        </w:r>
+        <w:r>
+          <w:rPr>
+            <w:noProof/>
+            <w:webHidden/>
+          </w:rPr>
+          <w:t>4</w:t>
+        </w:r>
+        <w:r>
+          <w:rPr>
+            <w:noProof/>
+            <w:webHidden/>
+          </w:rPr>
+          <w:fldChar w:fldCharType="end"/>
+        </w:r>
+      </w:hyperlink>
+    </w:p>
+    <w:p>
+      <w:pPr>
+        <w:pStyle w:val="TM2"/>
+        <w:tabs>
+          <w:tab w:val="left" w:pos="800"/>
+          <w:tab w:val="right" w:leader="dot" w:pos="9060"/>
+        </w:tabs>
+        <w:rPr>
+          <w:rFonts w:eastAsiaTheme="minorEastAsia" w:cstheme="minorBidi"/>
+          <w:smallCaps w:val="0"/>
+          <w:noProof/>
+          <w:kern w:val="2"/>
+          <w:sz w:val="24"/>
+          <w:szCs w:val="24"/>
+          <w14:ligatures w14:val="standardContextual"/>
+        </w:rPr>
+      </w:pPr>
+      <w:hyperlink w:anchor="_Toc218496178" w:history="1">
+        <w:r>
+          <w:rPr>
+            <w:rStyle w:val="Lienhypertexte"/>
+            <w:noProof/>
+          </w:rPr>
+          <w:t>2.6</w:t>
+        </w:r>
+        <w:r>
+          <w:rPr>
+            <w:rFonts w:eastAsiaTheme="minorEastAsia" w:cstheme="minorBidi"/>
+            <w:smallCaps w:val="0"/>
+            <w:noProof/>
+            <w:kern w:val="2"/>
+            <w:sz w:val="24"/>
+            <w:szCs w:val="24"/>
+            <w14:ligatures w14:val="standardContextual"/>
+          </w:rPr>
+          <w:tab/>
+        </w:r>
+        <w:r>
+          <w:rPr>
+            <w:rStyle w:val="Lienhypertexte"/>
+            <w:noProof/>
+          </w:rPr>
+          <w:t>Schéma</w:t>
+        </w:r>
+        <w:r>
+          <w:rPr>
+            <w:noProof/>
+            <w:webHidden/>
+          </w:rPr>
+          <w:tab/>
+        </w:r>
+        <w:r>
+          <w:rPr>
+            <w:noProof/>
+            <w:webHidden/>
+          </w:rPr>
+          <w:fldChar w:fldCharType="begin"/>
+        </w:r>
+        <w:r>
+          <w:rPr>
+            <w:noProof/>
+            <w:webHidden/>
+          </w:rPr>
+          <w:instrText xml:space="preserve"> PAGEREF _Toc218496178 \h </w:instrText>
         </w:r>
         <w:r>
           <w:rPr>
@@ -1654,11 +1130,13 @@
           <w:bCs w:val="0"/>
           <w:caps w:val="0"/>
           <w:noProof/>
-          <w:sz w:val="22"/>
-          <w:szCs w:val="22"/>
+          <w:kern w:val="2"/>
+          <w:sz w:val="24"/>
+          <w:szCs w:val="24"/>
+          <w14:ligatures w14:val="standardContextual"/>
         </w:rPr>
       </w:pPr>
-      <w:hyperlink w:anchor="_Toc308526332" w:history="1">
+      <w:hyperlink w:anchor="_Toc218496179" w:history="1">
         <w:r>
           <w:rPr>
             <w:rStyle w:val="Lienhypertexte"/>
@@ -1673,8 +1151,10 @@
             <w:bCs w:val="0"/>
             <w:caps w:val="0"/>
             <w:noProof/>
-            <w:sz w:val="22"/>
-            <w:szCs w:val="22"/>
+            <w:kern w:val="2"/>
+            <w:sz w:val="24"/>
+            <w:szCs w:val="24"/>
+            <w14:ligatures w14:val="standardContextual"/>
           </w:rPr>
           <w:tab/>
         </w:r>
@@ -1683,7 +1163,7 @@
             <w:rStyle w:val="Lienhypertexte"/>
             <w:noProof/>
           </w:rPr>
-          <w:t>Analyse</w:t>
+          <w:t>Conclusion</w:t>
         </w:r>
         <w:r>
           <w:rPr>
@@ -1704,7 +1184,7 @@
             <w:noProof/>
             <w:webHidden/>
           </w:rPr>
-          <w:instrText xml:space="preserve"> PAGEREF _Toc308526332 \h </w:instrText>
+          <w:instrText xml:space="preserve"> PAGEREF _Toc218496179 \h </w:instrText>
         </w:r>
         <w:r>
           <w:rPr>
@@ -1746,11 +1226,13 @@
           <w:rFonts w:eastAsiaTheme="minorEastAsia" w:cstheme="minorBidi"/>
           <w:smallCaps w:val="0"/>
           <w:noProof/>
-          <w:sz w:val="22"/>
-          <w:szCs w:val="22"/>
+          <w:kern w:val="2"/>
+          <w:sz w:val="24"/>
+          <w:szCs w:val="24"/>
+          <w14:ligatures w14:val="standardContextual"/>
         </w:rPr>
       </w:pPr>
-      <w:hyperlink w:anchor="_Toc308526333" w:history="1">
+      <w:hyperlink w:anchor="_Toc218496180" w:history="1">
         <w:r>
           <w:rPr>
             <w:rStyle w:val="Lienhypertexte"/>
@@ -1763,8 +1245,10 @@
             <w:rFonts w:eastAsiaTheme="minorEastAsia" w:cstheme="minorBidi"/>
             <w:smallCaps w:val="0"/>
             <w:noProof/>
-            <w:sz w:val="22"/>
-            <w:szCs w:val="22"/>
+            <w:kern w:val="2"/>
+            <w:sz w:val="24"/>
+            <w:szCs w:val="24"/>
+            <w14:ligatures w14:val="standardContextual"/>
           </w:rPr>
           <w:tab/>
         </w:r>
@@ -1773,7 +1257,7 @@
             <w:rStyle w:val="Lienhypertexte"/>
             <w:noProof/>
           </w:rPr>
-          <w:t>Opportunités</w:t>
+          <w:t>Bilan des fonctionnalités demandées</w:t>
         </w:r>
         <w:r>
           <w:rPr>
@@ -1794,7 +1278,7 @@
             <w:noProof/>
             <w:webHidden/>
           </w:rPr>
-          <w:instrText xml:space="preserve"> PAGEREF _Toc308526333 \h </w:instrText>
+          <w:instrText xml:space="preserve"> PAGEREF _Toc218496180 \h </w:instrText>
         </w:r>
         <w:r>
           <w:rPr>
@@ -1836,11 +1320,13 @@
           <w:rFonts w:eastAsiaTheme="minorEastAsia" w:cstheme="minorBidi"/>
           <w:smallCaps w:val="0"/>
           <w:noProof/>
-          <w:sz w:val="22"/>
-          <w:szCs w:val="22"/>
+          <w:kern w:val="2"/>
+          <w:sz w:val="24"/>
+          <w:szCs w:val="24"/>
+          <w14:ligatures w14:val="standardContextual"/>
         </w:rPr>
       </w:pPr>
-      <w:hyperlink w:anchor="_Toc308526334" w:history="1">
+      <w:hyperlink w:anchor="_Toc218496181" w:history="1">
         <w:r>
           <w:rPr>
             <w:rStyle w:val="Lienhypertexte"/>
@@ -1853,8 +1339,10 @@
             <w:rFonts w:eastAsiaTheme="minorEastAsia" w:cstheme="minorBidi"/>
             <w:smallCaps w:val="0"/>
             <w:noProof/>
-            <w:sz w:val="22"/>
-            <w:szCs w:val="22"/>
+            <w:kern w:val="2"/>
+            <w:sz w:val="24"/>
+            <w:szCs w:val="24"/>
+            <w14:ligatures w14:val="standardContextual"/>
           </w:rPr>
           <w:tab/>
         </w:r>
@@ -1863,7 +1351,7 @@
             <w:rStyle w:val="Lienhypertexte"/>
             <w:noProof/>
           </w:rPr>
-          <w:t>Document d’analyse et conception</w:t>
+          <w:t>Bilan de la planification</w:t>
         </w:r>
         <w:r>
           <w:rPr>
@@ -1884,7 +1372,7 @@
             <w:noProof/>
             <w:webHidden/>
           </w:rPr>
-          <w:instrText xml:space="preserve"> PAGEREF _Toc308526334 \h </w:instrText>
+          <w:instrText xml:space="preserve"> PAGEREF _Toc218496181 \h </w:instrText>
         </w:r>
         <w:r>
           <w:rPr>
@@ -1926,11 +1414,13 @@
           <w:rFonts w:eastAsiaTheme="minorEastAsia" w:cstheme="minorBidi"/>
           <w:smallCaps w:val="0"/>
           <w:noProof/>
-          <w:sz w:val="22"/>
-          <w:szCs w:val="22"/>
+          <w:kern w:val="2"/>
+          <w:sz w:val="24"/>
+          <w:szCs w:val="24"/>
+          <w14:ligatures w14:val="standardContextual"/>
         </w:rPr>
       </w:pPr>
-      <w:hyperlink w:anchor="_Toc308526335" w:history="1">
+      <w:hyperlink w:anchor="_Toc218496182" w:history="1">
         <w:r>
           <w:rPr>
             <w:rStyle w:val="Lienhypertexte"/>
@@ -1943,8 +1433,10 @@
             <w:rFonts w:eastAsiaTheme="minorEastAsia" w:cstheme="minorBidi"/>
             <w:smallCaps w:val="0"/>
             <w:noProof/>
-            <w:sz w:val="22"/>
-            <w:szCs w:val="22"/>
+            <w:kern w:val="2"/>
+            <w:sz w:val="24"/>
+            <w:szCs w:val="24"/>
+            <w14:ligatures w14:val="standardContextual"/>
           </w:rPr>
           <w:tab/>
         </w:r>
@@ -1953,7 +1445,7 @@
             <w:rStyle w:val="Lienhypertexte"/>
             <w:noProof/>
           </w:rPr>
-          <w:t>Conception des tests</w:t>
+          <w:t>Bilan personnel</w:t>
         </w:r>
         <w:r>
           <w:rPr>
@@ -1974,7 +1466,7 @@
             <w:noProof/>
             <w:webHidden/>
           </w:rPr>
-          <w:instrText xml:space="preserve"> PAGEREF _Toc308526335 \h </w:instrText>
+          <w:instrText xml:space="preserve"> PAGEREF _Toc218496182 \h </w:instrText>
         </w:r>
         <w:r>
           <w:rPr>
@@ -1994,97 +1486,7 @@
             <w:noProof/>
             <w:webHidden/>
           </w:rPr>
-          <w:t>5</w:t>
-        </w:r>
-        <w:r>
-          <w:rPr>
-            <w:noProof/>
-            <w:webHidden/>
-          </w:rPr>
-          <w:fldChar w:fldCharType="end"/>
-        </w:r>
-      </w:hyperlink>
-    </w:p>
-    <w:p>
-      <w:pPr>
-        <w:pStyle w:val="TM2"/>
-        <w:tabs>
-          <w:tab w:val="left" w:pos="800"/>
-          <w:tab w:val="right" w:leader="dot" w:pos="9060"/>
-        </w:tabs>
-        <w:rPr>
-          <w:rFonts w:eastAsiaTheme="minorEastAsia" w:cstheme="minorBidi"/>
-          <w:smallCaps w:val="0"/>
-          <w:noProof/>
-          <w:sz w:val="22"/>
-          <w:szCs w:val="22"/>
-        </w:rPr>
-      </w:pPr>
-      <w:hyperlink w:anchor="_Toc308526336" w:history="1">
-        <w:r>
-          <w:rPr>
-            <w:rStyle w:val="Lienhypertexte"/>
-            <w:noProof/>
-          </w:rPr>
-          <w:t>3.4</w:t>
-        </w:r>
-        <w:r>
-          <w:rPr>
-            <w:rFonts w:eastAsiaTheme="minorEastAsia" w:cstheme="minorBidi"/>
-            <w:smallCaps w:val="0"/>
-            <w:noProof/>
-            <w:sz w:val="22"/>
-            <w:szCs w:val="22"/>
-          </w:rPr>
-          <w:tab/>
-        </w:r>
-        <w:r>
-          <w:rPr>
-            <w:rStyle w:val="Lienhypertexte"/>
-            <w:noProof/>
-          </w:rPr>
-          <w:t>Planification détaillée</w:t>
-        </w:r>
-        <w:r>
-          <w:rPr>
-            <w:noProof/>
-            <w:webHidden/>
-          </w:rPr>
-          <w:tab/>
-        </w:r>
-        <w:r>
-          <w:rPr>
-            <w:noProof/>
-            <w:webHidden/>
-          </w:rPr>
-          <w:fldChar w:fldCharType="begin"/>
-        </w:r>
-        <w:r>
-          <w:rPr>
-            <w:noProof/>
-            <w:webHidden/>
-          </w:rPr>
-          <w:instrText xml:space="preserve"> PAGEREF _Toc308526336 \h </w:instrText>
-        </w:r>
-        <w:r>
-          <w:rPr>
-            <w:noProof/>
-            <w:webHidden/>
-          </w:rPr>
-        </w:r>
-        <w:r>
-          <w:rPr>
-            <w:noProof/>
-            <w:webHidden/>
-          </w:rPr>
-          <w:fldChar w:fldCharType="separate"/>
-        </w:r>
-        <w:r>
-          <w:rPr>
-            <w:noProof/>
-            <w:webHidden/>
-          </w:rPr>
-          <w:t>5</w:t>
+          <w:t>4</w:t>
         </w:r>
         <w:r>
           <w:rPr>
@@ -2108,11 +1510,13 @@
           <w:bCs w:val="0"/>
           <w:caps w:val="0"/>
           <w:noProof/>
-          <w:sz w:val="22"/>
-          <w:szCs w:val="22"/>
+          <w:kern w:val="2"/>
+          <w:sz w:val="24"/>
+          <w:szCs w:val="24"/>
+          <w14:ligatures w14:val="standardContextual"/>
         </w:rPr>
       </w:pPr>
-      <w:hyperlink w:anchor="_Toc308526337" w:history="1">
+      <w:hyperlink w:anchor="_Toc218496183" w:history="1">
         <w:r>
           <w:rPr>
             <w:rStyle w:val="Lienhypertexte"/>
@@ -2127,8 +1531,10 @@
             <w:bCs w:val="0"/>
             <w:caps w:val="0"/>
             <w:noProof/>
-            <w:sz w:val="22"/>
-            <w:szCs w:val="22"/>
+            <w:kern w:val="2"/>
+            <w:sz w:val="24"/>
+            <w:szCs w:val="24"/>
+            <w14:ligatures w14:val="standardContextual"/>
           </w:rPr>
           <w:tab/>
         </w:r>
@@ -2137,7 +1543,7 @@
             <w:rStyle w:val="Lienhypertexte"/>
             <w:noProof/>
           </w:rPr>
-          <w:t>Réalisation</w:t>
+          <w:t>Divers</w:t>
         </w:r>
         <w:r>
           <w:rPr>
@@ -2158,7 +1564,7 @@
             <w:noProof/>
             <w:webHidden/>
           </w:rPr>
-          <w:instrText xml:space="preserve"> PAGEREF _Toc308526337 \h </w:instrText>
+          <w:instrText xml:space="preserve"> PAGEREF _Toc218496183 \h </w:instrText>
         </w:r>
         <w:r>
           <w:rPr>
@@ -2200,11 +1606,13 @@
           <w:rFonts w:eastAsiaTheme="minorEastAsia" w:cstheme="minorBidi"/>
           <w:smallCaps w:val="0"/>
           <w:noProof/>
-          <w:sz w:val="22"/>
-          <w:szCs w:val="22"/>
+          <w:kern w:val="2"/>
+          <w:sz w:val="24"/>
+          <w:szCs w:val="24"/>
+          <w14:ligatures w14:val="standardContextual"/>
         </w:rPr>
       </w:pPr>
-      <w:hyperlink w:anchor="_Toc308526338" w:history="1">
+      <w:hyperlink w:anchor="_Toc218496184" w:history="1">
         <w:r>
           <w:rPr>
             <w:rStyle w:val="Lienhypertexte"/>
@@ -2217,8 +1625,10 @@
             <w:rFonts w:eastAsiaTheme="minorEastAsia" w:cstheme="minorBidi"/>
             <w:smallCaps w:val="0"/>
             <w:noProof/>
-            <w:sz w:val="22"/>
-            <w:szCs w:val="22"/>
+            <w:kern w:val="2"/>
+            <w:sz w:val="24"/>
+            <w:szCs w:val="24"/>
+            <w14:ligatures w14:val="standardContextual"/>
           </w:rPr>
           <w:tab/>
         </w:r>
@@ -2227,7 +1637,7 @@
             <w:rStyle w:val="Lienhypertexte"/>
             <w:noProof/>
           </w:rPr>
-          <w:t>Dossier de Réalisation</w:t>
+          <w:t>Webographie</w:t>
         </w:r>
         <w:r>
           <w:rPr>
@@ -2248,7 +1658,7 @@
             <w:noProof/>
             <w:webHidden/>
           </w:rPr>
-          <w:instrText xml:space="preserve"> PAGEREF _Toc308526338 \h </w:instrText>
+          <w:instrText xml:space="preserve"> PAGEREF _Toc218496184 \h </w:instrText>
         </w:r>
         <w:r>
           <w:rPr>
@@ -2269,1102 +1679,6 @@
             <w:webHidden/>
           </w:rPr>
           <w:t>5</w:t>
-        </w:r>
-        <w:r>
-          <w:rPr>
-            <w:noProof/>
-            <w:webHidden/>
-          </w:rPr>
-          <w:fldChar w:fldCharType="end"/>
-        </w:r>
-      </w:hyperlink>
-    </w:p>
-    <w:p>
-      <w:pPr>
-        <w:pStyle w:val="TM2"/>
-        <w:tabs>
-          <w:tab w:val="left" w:pos="800"/>
-          <w:tab w:val="right" w:leader="dot" w:pos="9060"/>
-        </w:tabs>
-        <w:rPr>
-          <w:rFonts w:eastAsiaTheme="minorEastAsia" w:cstheme="minorBidi"/>
-          <w:smallCaps w:val="0"/>
-          <w:noProof/>
-          <w:sz w:val="22"/>
-          <w:szCs w:val="22"/>
-        </w:rPr>
-      </w:pPr>
-      <w:hyperlink w:anchor="_Toc308526339" w:history="1">
-        <w:r>
-          <w:rPr>
-            <w:rStyle w:val="Lienhypertexte"/>
-            <w:noProof/>
-          </w:rPr>
-          <w:t>4.2</w:t>
-        </w:r>
-        <w:r>
-          <w:rPr>
-            <w:rFonts w:eastAsiaTheme="minorEastAsia" w:cstheme="minorBidi"/>
-            <w:smallCaps w:val="0"/>
-            <w:noProof/>
-            <w:sz w:val="22"/>
-            <w:szCs w:val="22"/>
-          </w:rPr>
-          <w:tab/>
-        </w:r>
-        <w:r>
-          <w:rPr>
-            <w:rStyle w:val="Lienhypertexte"/>
-            <w:noProof/>
-          </w:rPr>
-          <w:t>Modifications</w:t>
-        </w:r>
-        <w:r>
-          <w:rPr>
-            <w:noProof/>
-            <w:webHidden/>
-          </w:rPr>
-          <w:tab/>
-        </w:r>
-        <w:r>
-          <w:rPr>
-            <w:noProof/>
-            <w:webHidden/>
-          </w:rPr>
-          <w:fldChar w:fldCharType="begin"/>
-        </w:r>
-        <w:r>
-          <w:rPr>
-            <w:noProof/>
-            <w:webHidden/>
-          </w:rPr>
-          <w:instrText xml:space="preserve"> PAGEREF _Toc308526339 \h </w:instrText>
-        </w:r>
-        <w:r>
-          <w:rPr>
-            <w:noProof/>
-            <w:webHidden/>
-          </w:rPr>
-        </w:r>
-        <w:r>
-          <w:rPr>
-            <w:noProof/>
-            <w:webHidden/>
-          </w:rPr>
-          <w:fldChar w:fldCharType="separate"/>
-        </w:r>
-        <w:r>
-          <w:rPr>
-            <w:noProof/>
-            <w:webHidden/>
-          </w:rPr>
-          <w:t>5</w:t>
-        </w:r>
-        <w:r>
-          <w:rPr>
-            <w:noProof/>
-            <w:webHidden/>
-          </w:rPr>
-          <w:fldChar w:fldCharType="end"/>
-        </w:r>
-      </w:hyperlink>
-    </w:p>
-    <w:p>
-      <w:pPr>
-        <w:pStyle w:val="TM10"/>
-        <w:tabs>
-          <w:tab w:val="left" w:pos="400"/>
-          <w:tab w:val="right" w:leader="dot" w:pos="9060"/>
-        </w:tabs>
-        <w:rPr>
-          <w:rFonts w:eastAsiaTheme="minorEastAsia" w:cstheme="minorBidi"/>
-          <w:b w:val="0"/>
-          <w:bCs w:val="0"/>
-          <w:caps w:val="0"/>
-          <w:noProof/>
-          <w:sz w:val="22"/>
-          <w:szCs w:val="22"/>
-        </w:rPr>
-      </w:pPr>
-      <w:hyperlink w:anchor="_Toc308526340" w:history="1">
-        <w:r>
-          <w:rPr>
-            <w:rStyle w:val="Lienhypertexte"/>
-            <w:noProof/>
-          </w:rPr>
-          <w:t>5</w:t>
-        </w:r>
-        <w:r>
-          <w:rPr>
-            <w:rFonts w:eastAsiaTheme="minorEastAsia" w:cstheme="minorBidi"/>
-            <w:b w:val="0"/>
-            <w:bCs w:val="0"/>
-            <w:caps w:val="0"/>
-            <w:noProof/>
-            <w:sz w:val="22"/>
-            <w:szCs w:val="22"/>
-          </w:rPr>
-          <w:tab/>
-        </w:r>
-        <w:r>
-          <w:rPr>
-            <w:rStyle w:val="Lienhypertexte"/>
-            <w:noProof/>
-          </w:rPr>
-          <w:t>Tests</w:t>
-        </w:r>
-        <w:r>
-          <w:rPr>
-            <w:noProof/>
-            <w:webHidden/>
-          </w:rPr>
-          <w:tab/>
-        </w:r>
-        <w:r>
-          <w:rPr>
-            <w:noProof/>
-            <w:webHidden/>
-          </w:rPr>
-          <w:fldChar w:fldCharType="begin"/>
-        </w:r>
-        <w:r>
-          <w:rPr>
-            <w:noProof/>
-            <w:webHidden/>
-          </w:rPr>
-          <w:instrText xml:space="preserve"> PAGEREF _Toc308526340 \h </w:instrText>
-        </w:r>
-        <w:r>
-          <w:rPr>
-            <w:noProof/>
-            <w:webHidden/>
-          </w:rPr>
-        </w:r>
-        <w:r>
-          <w:rPr>
-            <w:noProof/>
-            <w:webHidden/>
-          </w:rPr>
-          <w:fldChar w:fldCharType="separate"/>
-        </w:r>
-        <w:r>
-          <w:rPr>
-            <w:noProof/>
-            <w:webHidden/>
-          </w:rPr>
-          <w:t>5</w:t>
-        </w:r>
-        <w:r>
-          <w:rPr>
-            <w:noProof/>
-            <w:webHidden/>
-          </w:rPr>
-          <w:fldChar w:fldCharType="end"/>
-        </w:r>
-      </w:hyperlink>
-    </w:p>
-    <w:p>
-      <w:pPr>
-        <w:pStyle w:val="TM2"/>
-        <w:tabs>
-          <w:tab w:val="left" w:pos="800"/>
-          <w:tab w:val="right" w:leader="dot" w:pos="9060"/>
-        </w:tabs>
-        <w:rPr>
-          <w:rFonts w:eastAsiaTheme="minorEastAsia" w:cstheme="minorBidi"/>
-          <w:smallCaps w:val="0"/>
-          <w:noProof/>
-          <w:sz w:val="22"/>
-          <w:szCs w:val="22"/>
-        </w:rPr>
-      </w:pPr>
-      <w:hyperlink w:anchor="_Toc308526341" w:history="1">
-        <w:r>
-          <w:rPr>
-            <w:rStyle w:val="Lienhypertexte"/>
-            <w:noProof/>
-          </w:rPr>
-          <w:t>5.1</w:t>
-        </w:r>
-        <w:r>
-          <w:rPr>
-            <w:rFonts w:eastAsiaTheme="minorEastAsia" w:cstheme="minorBidi"/>
-            <w:smallCaps w:val="0"/>
-            <w:noProof/>
-            <w:sz w:val="22"/>
-            <w:szCs w:val="22"/>
-          </w:rPr>
-          <w:tab/>
-        </w:r>
-        <w:r>
-          <w:rPr>
-            <w:rStyle w:val="Lienhypertexte"/>
-            <w:noProof/>
-          </w:rPr>
-          <w:t>Dossier des tests</w:t>
-        </w:r>
-        <w:r>
-          <w:rPr>
-            <w:noProof/>
-            <w:webHidden/>
-          </w:rPr>
-          <w:tab/>
-        </w:r>
-        <w:r>
-          <w:rPr>
-            <w:noProof/>
-            <w:webHidden/>
-          </w:rPr>
-          <w:fldChar w:fldCharType="begin"/>
-        </w:r>
-        <w:r>
-          <w:rPr>
-            <w:noProof/>
-            <w:webHidden/>
-          </w:rPr>
-          <w:instrText xml:space="preserve"> PAGEREF _Toc308526341 \h </w:instrText>
-        </w:r>
-        <w:r>
-          <w:rPr>
-            <w:noProof/>
-            <w:webHidden/>
-          </w:rPr>
-        </w:r>
-        <w:r>
-          <w:rPr>
-            <w:noProof/>
-            <w:webHidden/>
-          </w:rPr>
-          <w:fldChar w:fldCharType="separate"/>
-        </w:r>
-        <w:r>
-          <w:rPr>
-            <w:noProof/>
-            <w:webHidden/>
-          </w:rPr>
-          <w:t>5</w:t>
-        </w:r>
-        <w:r>
-          <w:rPr>
-            <w:noProof/>
-            <w:webHidden/>
-          </w:rPr>
-          <w:fldChar w:fldCharType="end"/>
-        </w:r>
-      </w:hyperlink>
-    </w:p>
-    <w:p>
-      <w:pPr>
-        <w:pStyle w:val="TM10"/>
-        <w:tabs>
-          <w:tab w:val="left" w:pos="400"/>
-          <w:tab w:val="right" w:leader="dot" w:pos="9060"/>
-        </w:tabs>
-        <w:rPr>
-          <w:rFonts w:eastAsiaTheme="minorEastAsia" w:cstheme="minorBidi"/>
-          <w:b w:val="0"/>
-          <w:bCs w:val="0"/>
-          <w:caps w:val="0"/>
-          <w:noProof/>
-          <w:sz w:val="22"/>
-          <w:szCs w:val="22"/>
-        </w:rPr>
-      </w:pPr>
-      <w:hyperlink w:anchor="_Toc308526342" w:history="1">
-        <w:r>
-          <w:rPr>
-            <w:rStyle w:val="Lienhypertexte"/>
-            <w:noProof/>
-          </w:rPr>
-          <w:t>6</w:t>
-        </w:r>
-        <w:r>
-          <w:rPr>
-            <w:rFonts w:eastAsiaTheme="minorEastAsia" w:cstheme="minorBidi"/>
-            <w:b w:val="0"/>
-            <w:bCs w:val="0"/>
-            <w:caps w:val="0"/>
-            <w:noProof/>
-            <w:sz w:val="22"/>
-            <w:szCs w:val="22"/>
-          </w:rPr>
-          <w:tab/>
-        </w:r>
-        <w:r>
-          <w:rPr>
-            <w:rStyle w:val="Lienhypertexte"/>
-            <w:noProof/>
-          </w:rPr>
-          <w:t>Conclusion</w:t>
-        </w:r>
-        <w:r>
-          <w:rPr>
-            <w:noProof/>
-            <w:webHidden/>
-          </w:rPr>
-          <w:tab/>
-        </w:r>
-        <w:r>
-          <w:rPr>
-            <w:noProof/>
-            <w:webHidden/>
-          </w:rPr>
-          <w:fldChar w:fldCharType="begin"/>
-        </w:r>
-        <w:r>
-          <w:rPr>
-            <w:noProof/>
-            <w:webHidden/>
-          </w:rPr>
-          <w:instrText xml:space="preserve"> PAGEREF _Toc308526342 \h </w:instrText>
-        </w:r>
-        <w:r>
-          <w:rPr>
-            <w:noProof/>
-            <w:webHidden/>
-          </w:rPr>
-        </w:r>
-        <w:r>
-          <w:rPr>
-            <w:noProof/>
-            <w:webHidden/>
-          </w:rPr>
-          <w:fldChar w:fldCharType="separate"/>
-        </w:r>
-        <w:r>
-          <w:rPr>
-            <w:noProof/>
-            <w:webHidden/>
-          </w:rPr>
-          <w:t>5</w:t>
-        </w:r>
-        <w:r>
-          <w:rPr>
-            <w:noProof/>
-            <w:webHidden/>
-          </w:rPr>
-          <w:fldChar w:fldCharType="end"/>
-        </w:r>
-      </w:hyperlink>
-    </w:p>
-    <w:p>
-      <w:pPr>
-        <w:pStyle w:val="TM2"/>
-        <w:tabs>
-          <w:tab w:val="left" w:pos="800"/>
-          <w:tab w:val="right" w:leader="dot" w:pos="9060"/>
-        </w:tabs>
-        <w:rPr>
-          <w:rFonts w:eastAsiaTheme="minorEastAsia" w:cstheme="minorBidi"/>
-          <w:smallCaps w:val="0"/>
-          <w:noProof/>
-          <w:sz w:val="22"/>
-          <w:szCs w:val="22"/>
-        </w:rPr>
-      </w:pPr>
-      <w:hyperlink w:anchor="_Toc308526343" w:history="1">
-        <w:r>
-          <w:rPr>
-            <w:rStyle w:val="Lienhypertexte"/>
-            <w:noProof/>
-          </w:rPr>
-          <w:t>6.1</w:t>
-        </w:r>
-        <w:r>
-          <w:rPr>
-            <w:rFonts w:eastAsiaTheme="minorEastAsia" w:cstheme="minorBidi"/>
-            <w:smallCaps w:val="0"/>
-            <w:noProof/>
-            <w:sz w:val="22"/>
-            <w:szCs w:val="22"/>
-          </w:rPr>
-          <w:tab/>
-        </w:r>
-        <w:r>
-          <w:rPr>
-            <w:rStyle w:val="Lienhypertexte"/>
-            <w:noProof/>
-          </w:rPr>
-          <w:t>Bilan des fonctionnalités demandées</w:t>
-        </w:r>
-        <w:r>
-          <w:rPr>
-            <w:noProof/>
-            <w:webHidden/>
-          </w:rPr>
-          <w:tab/>
-        </w:r>
-        <w:r>
-          <w:rPr>
-            <w:noProof/>
-            <w:webHidden/>
-          </w:rPr>
-          <w:fldChar w:fldCharType="begin"/>
-        </w:r>
-        <w:r>
-          <w:rPr>
-            <w:noProof/>
-            <w:webHidden/>
-          </w:rPr>
-          <w:instrText xml:space="preserve"> PAGEREF _Toc308526343 \h </w:instrText>
-        </w:r>
-        <w:r>
-          <w:rPr>
-            <w:noProof/>
-            <w:webHidden/>
-          </w:rPr>
-        </w:r>
-        <w:r>
-          <w:rPr>
-            <w:noProof/>
-            <w:webHidden/>
-          </w:rPr>
-          <w:fldChar w:fldCharType="separate"/>
-        </w:r>
-        <w:r>
-          <w:rPr>
-            <w:noProof/>
-            <w:webHidden/>
-          </w:rPr>
-          <w:t>5</w:t>
-        </w:r>
-        <w:r>
-          <w:rPr>
-            <w:noProof/>
-            <w:webHidden/>
-          </w:rPr>
-          <w:fldChar w:fldCharType="end"/>
-        </w:r>
-      </w:hyperlink>
-    </w:p>
-    <w:p>
-      <w:pPr>
-        <w:pStyle w:val="TM2"/>
-        <w:tabs>
-          <w:tab w:val="left" w:pos="800"/>
-          <w:tab w:val="right" w:leader="dot" w:pos="9060"/>
-        </w:tabs>
-        <w:rPr>
-          <w:rFonts w:eastAsiaTheme="minorEastAsia" w:cstheme="minorBidi"/>
-          <w:smallCaps w:val="0"/>
-          <w:noProof/>
-          <w:sz w:val="22"/>
-          <w:szCs w:val="22"/>
-        </w:rPr>
-      </w:pPr>
-      <w:hyperlink w:anchor="_Toc308526344" w:history="1">
-        <w:r>
-          <w:rPr>
-            <w:rStyle w:val="Lienhypertexte"/>
-            <w:noProof/>
-          </w:rPr>
-          <w:t>6.2</w:t>
-        </w:r>
-        <w:r>
-          <w:rPr>
-            <w:rFonts w:eastAsiaTheme="minorEastAsia" w:cstheme="minorBidi"/>
-            <w:smallCaps w:val="0"/>
-            <w:noProof/>
-            <w:sz w:val="22"/>
-            <w:szCs w:val="22"/>
-          </w:rPr>
-          <w:tab/>
-        </w:r>
-        <w:r>
-          <w:rPr>
-            <w:rStyle w:val="Lienhypertexte"/>
-            <w:noProof/>
-          </w:rPr>
-          <w:t>Bilan de la planification</w:t>
-        </w:r>
-        <w:r>
-          <w:rPr>
-            <w:noProof/>
-            <w:webHidden/>
-          </w:rPr>
-          <w:tab/>
-        </w:r>
-        <w:r>
-          <w:rPr>
-            <w:noProof/>
-            <w:webHidden/>
-          </w:rPr>
-          <w:fldChar w:fldCharType="begin"/>
-        </w:r>
-        <w:r>
-          <w:rPr>
-            <w:noProof/>
-            <w:webHidden/>
-          </w:rPr>
-          <w:instrText xml:space="preserve"> PAGEREF _Toc308526344 \h </w:instrText>
-        </w:r>
-        <w:r>
-          <w:rPr>
-            <w:noProof/>
-            <w:webHidden/>
-          </w:rPr>
-        </w:r>
-        <w:r>
-          <w:rPr>
-            <w:noProof/>
-            <w:webHidden/>
-          </w:rPr>
-          <w:fldChar w:fldCharType="separate"/>
-        </w:r>
-        <w:r>
-          <w:rPr>
-            <w:noProof/>
-            <w:webHidden/>
-          </w:rPr>
-          <w:t>5</w:t>
-        </w:r>
-        <w:r>
-          <w:rPr>
-            <w:noProof/>
-            <w:webHidden/>
-          </w:rPr>
-          <w:fldChar w:fldCharType="end"/>
-        </w:r>
-      </w:hyperlink>
-    </w:p>
-    <w:p>
-      <w:pPr>
-        <w:pStyle w:val="TM2"/>
-        <w:tabs>
-          <w:tab w:val="left" w:pos="800"/>
-          <w:tab w:val="right" w:leader="dot" w:pos="9060"/>
-        </w:tabs>
-        <w:rPr>
-          <w:rFonts w:eastAsiaTheme="minorEastAsia" w:cstheme="minorBidi"/>
-          <w:smallCaps w:val="0"/>
-          <w:noProof/>
-          <w:sz w:val="22"/>
-          <w:szCs w:val="22"/>
-        </w:rPr>
-      </w:pPr>
-      <w:hyperlink w:anchor="_Toc308526345" w:history="1">
-        <w:r>
-          <w:rPr>
-            <w:rStyle w:val="Lienhypertexte"/>
-            <w:noProof/>
-          </w:rPr>
-          <w:t>6.3</w:t>
-        </w:r>
-        <w:r>
-          <w:rPr>
-            <w:rFonts w:eastAsiaTheme="minorEastAsia" w:cstheme="minorBidi"/>
-            <w:smallCaps w:val="0"/>
-            <w:noProof/>
-            <w:sz w:val="22"/>
-            <w:szCs w:val="22"/>
-          </w:rPr>
-          <w:tab/>
-        </w:r>
-        <w:r>
-          <w:rPr>
-            <w:rStyle w:val="Lienhypertexte"/>
-            <w:noProof/>
-          </w:rPr>
-          <w:t>Bilan personnel</w:t>
-        </w:r>
-        <w:r>
-          <w:rPr>
-            <w:noProof/>
-            <w:webHidden/>
-          </w:rPr>
-          <w:tab/>
-        </w:r>
-        <w:r>
-          <w:rPr>
-            <w:noProof/>
-            <w:webHidden/>
-          </w:rPr>
-          <w:fldChar w:fldCharType="begin"/>
-        </w:r>
-        <w:r>
-          <w:rPr>
-            <w:noProof/>
-            <w:webHidden/>
-          </w:rPr>
-          <w:instrText xml:space="preserve"> PAGEREF _Toc308526345 \h </w:instrText>
-        </w:r>
-        <w:r>
-          <w:rPr>
-            <w:noProof/>
-            <w:webHidden/>
-          </w:rPr>
-        </w:r>
-        <w:r>
-          <w:rPr>
-            <w:noProof/>
-            <w:webHidden/>
-          </w:rPr>
-          <w:fldChar w:fldCharType="separate"/>
-        </w:r>
-        <w:r>
-          <w:rPr>
-            <w:noProof/>
-            <w:webHidden/>
-          </w:rPr>
-          <w:t>5</w:t>
-        </w:r>
-        <w:r>
-          <w:rPr>
-            <w:noProof/>
-            <w:webHidden/>
-          </w:rPr>
-          <w:fldChar w:fldCharType="end"/>
-        </w:r>
-      </w:hyperlink>
-    </w:p>
-    <w:p>
-      <w:pPr>
-        <w:pStyle w:val="TM10"/>
-        <w:tabs>
-          <w:tab w:val="left" w:pos="400"/>
-          <w:tab w:val="right" w:leader="dot" w:pos="9060"/>
-        </w:tabs>
-        <w:rPr>
-          <w:rFonts w:eastAsiaTheme="minorEastAsia" w:cstheme="minorBidi"/>
-          <w:b w:val="0"/>
-          <w:bCs w:val="0"/>
-          <w:caps w:val="0"/>
-          <w:noProof/>
-          <w:sz w:val="22"/>
-          <w:szCs w:val="22"/>
-        </w:rPr>
-      </w:pPr>
-      <w:hyperlink w:anchor="_Toc308526346" w:history="1">
-        <w:r>
-          <w:rPr>
-            <w:rStyle w:val="Lienhypertexte"/>
-            <w:noProof/>
-          </w:rPr>
-          <w:t>7</w:t>
-        </w:r>
-        <w:r>
-          <w:rPr>
-            <w:rFonts w:eastAsiaTheme="minorEastAsia" w:cstheme="minorBidi"/>
-            <w:b w:val="0"/>
-            <w:bCs w:val="0"/>
-            <w:caps w:val="0"/>
-            <w:noProof/>
-            <w:sz w:val="22"/>
-            <w:szCs w:val="22"/>
-          </w:rPr>
-          <w:tab/>
-        </w:r>
-        <w:r>
-          <w:rPr>
-            <w:rStyle w:val="Lienhypertexte"/>
-            <w:noProof/>
-          </w:rPr>
-          <w:t>Divers</w:t>
-        </w:r>
-        <w:r>
-          <w:rPr>
-            <w:noProof/>
-            <w:webHidden/>
-          </w:rPr>
-          <w:tab/>
-        </w:r>
-        <w:r>
-          <w:rPr>
-            <w:noProof/>
-            <w:webHidden/>
-          </w:rPr>
-          <w:fldChar w:fldCharType="begin"/>
-        </w:r>
-        <w:r>
-          <w:rPr>
-            <w:noProof/>
-            <w:webHidden/>
-          </w:rPr>
-          <w:instrText xml:space="preserve"> PAGEREF _Toc308526346 \h </w:instrText>
-        </w:r>
-        <w:r>
-          <w:rPr>
-            <w:noProof/>
-            <w:webHidden/>
-          </w:rPr>
-        </w:r>
-        <w:r>
-          <w:rPr>
-            <w:noProof/>
-            <w:webHidden/>
-          </w:rPr>
-          <w:fldChar w:fldCharType="separate"/>
-        </w:r>
-        <w:r>
-          <w:rPr>
-            <w:noProof/>
-            <w:webHidden/>
-          </w:rPr>
-          <w:t>6</w:t>
-        </w:r>
-        <w:r>
-          <w:rPr>
-            <w:noProof/>
-            <w:webHidden/>
-          </w:rPr>
-          <w:fldChar w:fldCharType="end"/>
-        </w:r>
-      </w:hyperlink>
-    </w:p>
-    <w:p>
-      <w:pPr>
-        <w:pStyle w:val="TM2"/>
-        <w:tabs>
-          <w:tab w:val="left" w:pos="800"/>
-          <w:tab w:val="right" w:leader="dot" w:pos="9060"/>
-        </w:tabs>
-        <w:rPr>
-          <w:rFonts w:eastAsiaTheme="minorEastAsia" w:cstheme="minorBidi"/>
-          <w:smallCaps w:val="0"/>
-          <w:noProof/>
-          <w:sz w:val="22"/>
-          <w:szCs w:val="22"/>
-        </w:rPr>
-      </w:pPr>
-      <w:hyperlink w:anchor="_Toc308526347" w:history="1">
-        <w:r>
-          <w:rPr>
-            <w:rStyle w:val="Lienhypertexte"/>
-            <w:noProof/>
-          </w:rPr>
-          <w:t>7.1</w:t>
-        </w:r>
-        <w:r>
-          <w:rPr>
-            <w:rFonts w:eastAsiaTheme="minorEastAsia" w:cstheme="minorBidi"/>
-            <w:smallCaps w:val="0"/>
-            <w:noProof/>
-            <w:sz w:val="22"/>
-            <w:szCs w:val="22"/>
-          </w:rPr>
-          <w:tab/>
-        </w:r>
-        <w:r>
-          <w:rPr>
-            <w:rStyle w:val="Lienhypertexte"/>
-            <w:noProof/>
-          </w:rPr>
-          <w:t>Journal de travail</w:t>
-        </w:r>
-        <w:r>
-          <w:rPr>
-            <w:noProof/>
-            <w:webHidden/>
-          </w:rPr>
-          <w:tab/>
-        </w:r>
-        <w:r>
-          <w:rPr>
-            <w:noProof/>
-            <w:webHidden/>
-          </w:rPr>
-          <w:fldChar w:fldCharType="begin"/>
-        </w:r>
-        <w:r>
-          <w:rPr>
-            <w:noProof/>
-            <w:webHidden/>
-          </w:rPr>
-          <w:instrText xml:space="preserve"> PAGEREF _Toc308526347 \h </w:instrText>
-        </w:r>
-        <w:r>
-          <w:rPr>
-            <w:noProof/>
-            <w:webHidden/>
-          </w:rPr>
-        </w:r>
-        <w:r>
-          <w:rPr>
-            <w:noProof/>
-            <w:webHidden/>
-          </w:rPr>
-          <w:fldChar w:fldCharType="separate"/>
-        </w:r>
-        <w:r>
-          <w:rPr>
-            <w:noProof/>
-            <w:webHidden/>
-          </w:rPr>
-          <w:t>6</w:t>
-        </w:r>
-        <w:r>
-          <w:rPr>
-            <w:noProof/>
-            <w:webHidden/>
-          </w:rPr>
-          <w:fldChar w:fldCharType="end"/>
-        </w:r>
-      </w:hyperlink>
-    </w:p>
-    <w:p>
-      <w:pPr>
-        <w:pStyle w:val="TM2"/>
-        <w:tabs>
-          <w:tab w:val="left" w:pos="800"/>
-          <w:tab w:val="right" w:leader="dot" w:pos="9060"/>
-        </w:tabs>
-        <w:rPr>
-          <w:rFonts w:eastAsiaTheme="minorEastAsia" w:cstheme="minorBidi"/>
-          <w:smallCaps w:val="0"/>
-          <w:noProof/>
-          <w:sz w:val="22"/>
-          <w:szCs w:val="22"/>
-        </w:rPr>
-      </w:pPr>
-      <w:hyperlink w:anchor="_Toc308526348" w:history="1">
-        <w:r>
-          <w:rPr>
-            <w:rStyle w:val="Lienhypertexte"/>
-            <w:noProof/>
-          </w:rPr>
-          <w:t>7.2</w:t>
-        </w:r>
-        <w:r>
-          <w:rPr>
-            <w:rFonts w:eastAsiaTheme="minorEastAsia" w:cstheme="minorBidi"/>
-            <w:smallCaps w:val="0"/>
-            <w:noProof/>
-            <w:sz w:val="22"/>
-            <w:szCs w:val="22"/>
-          </w:rPr>
-          <w:tab/>
-        </w:r>
-        <w:r>
-          <w:rPr>
-            <w:rStyle w:val="Lienhypertexte"/>
-            <w:noProof/>
-          </w:rPr>
-          <w:t>Bibliographie</w:t>
-        </w:r>
-        <w:r>
-          <w:rPr>
-            <w:noProof/>
-            <w:webHidden/>
-          </w:rPr>
-          <w:tab/>
-        </w:r>
-        <w:r>
-          <w:rPr>
-            <w:noProof/>
-            <w:webHidden/>
-          </w:rPr>
-          <w:fldChar w:fldCharType="begin"/>
-        </w:r>
-        <w:r>
-          <w:rPr>
-            <w:noProof/>
-            <w:webHidden/>
-          </w:rPr>
-          <w:instrText xml:space="preserve"> PAGEREF _Toc308526348 \h </w:instrText>
-        </w:r>
-        <w:r>
-          <w:rPr>
-            <w:noProof/>
-            <w:webHidden/>
-          </w:rPr>
-        </w:r>
-        <w:r>
-          <w:rPr>
-            <w:noProof/>
-            <w:webHidden/>
-          </w:rPr>
-          <w:fldChar w:fldCharType="separate"/>
-        </w:r>
-        <w:r>
-          <w:rPr>
-            <w:noProof/>
-            <w:webHidden/>
-          </w:rPr>
-          <w:t>6</w:t>
-        </w:r>
-        <w:r>
-          <w:rPr>
-            <w:noProof/>
-            <w:webHidden/>
-          </w:rPr>
-          <w:fldChar w:fldCharType="end"/>
-        </w:r>
-      </w:hyperlink>
-    </w:p>
-    <w:p>
-      <w:pPr>
-        <w:pStyle w:val="TM2"/>
-        <w:tabs>
-          <w:tab w:val="left" w:pos="800"/>
-          <w:tab w:val="right" w:leader="dot" w:pos="9060"/>
-        </w:tabs>
-        <w:rPr>
-          <w:rFonts w:eastAsiaTheme="minorEastAsia" w:cstheme="minorBidi"/>
-          <w:smallCaps w:val="0"/>
-          <w:noProof/>
-          <w:sz w:val="22"/>
-          <w:szCs w:val="22"/>
-        </w:rPr>
-      </w:pPr>
-      <w:hyperlink w:anchor="_Toc308526349" w:history="1">
-        <w:r>
-          <w:rPr>
-            <w:rStyle w:val="Lienhypertexte"/>
-            <w:noProof/>
-          </w:rPr>
-          <w:t>7.3</w:t>
-        </w:r>
-        <w:r>
-          <w:rPr>
-            <w:rFonts w:eastAsiaTheme="minorEastAsia" w:cstheme="minorBidi"/>
-            <w:smallCaps w:val="0"/>
-            <w:noProof/>
-            <w:sz w:val="22"/>
-            <w:szCs w:val="22"/>
-          </w:rPr>
-          <w:tab/>
-        </w:r>
-        <w:r>
-          <w:rPr>
-            <w:rStyle w:val="Lienhypertexte"/>
-            <w:noProof/>
-          </w:rPr>
-          <w:t>Webographie</w:t>
-        </w:r>
-        <w:r>
-          <w:rPr>
-            <w:noProof/>
-            <w:webHidden/>
-          </w:rPr>
-          <w:tab/>
-        </w:r>
-        <w:r>
-          <w:rPr>
-            <w:noProof/>
-            <w:webHidden/>
-          </w:rPr>
-          <w:fldChar w:fldCharType="begin"/>
-        </w:r>
-        <w:r>
-          <w:rPr>
-            <w:noProof/>
-            <w:webHidden/>
-          </w:rPr>
-          <w:instrText xml:space="preserve"> PAGEREF _Toc308526349 \h </w:instrText>
-        </w:r>
-        <w:r>
-          <w:rPr>
-            <w:noProof/>
-            <w:webHidden/>
-          </w:rPr>
-        </w:r>
-        <w:r>
-          <w:rPr>
-            <w:noProof/>
-            <w:webHidden/>
-          </w:rPr>
-          <w:fldChar w:fldCharType="separate"/>
-        </w:r>
-        <w:r>
-          <w:rPr>
-            <w:noProof/>
-            <w:webHidden/>
-          </w:rPr>
-          <w:t>6</w:t>
-        </w:r>
-        <w:r>
-          <w:rPr>
-            <w:noProof/>
-            <w:webHidden/>
-          </w:rPr>
-          <w:fldChar w:fldCharType="end"/>
-        </w:r>
-      </w:hyperlink>
-    </w:p>
-    <w:p>
-      <w:pPr>
-        <w:pStyle w:val="TM10"/>
-        <w:tabs>
-          <w:tab w:val="left" w:pos="400"/>
-          <w:tab w:val="right" w:leader="dot" w:pos="9060"/>
-        </w:tabs>
-        <w:rPr>
-          <w:rFonts w:eastAsiaTheme="minorEastAsia" w:cstheme="minorBidi"/>
-          <w:b w:val="0"/>
-          <w:bCs w:val="0"/>
-          <w:caps w:val="0"/>
-          <w:noProof/>
-          <w:sz w:val="22"/>
-          <w:szCs w:val="22"/>
-        </w:rPr>
-      </w:pPr>
-      <w:hyperlink w:anchor="_Toc308526350" w:history="1">
-        <w:r>
-          <w:rPr>
-            <w:rStyle w:val="Lienhypertexte"/>
-            <w:noProof/>
-          </w:rPr>
-          <w:t>8</w:t>
-        </w:r>
-        <w:r>
-          <w:rPr>
-            <w:rFonts w:eastAsiaTheme="minorEastAsia" w:cstheme="minorBidi"/>
-            <w:b w:val="0"/>
-            <w:bCs w:val="0"/>
-            <w:caps w:val="0"/>
-            <w:noProof/>
-            <w:sz w:val="22"/>
-            <w:szCs w:val="22"/>
-          </w:rPr>
-          <w:tab/>
-        </w:r>
-        <w:r>
-          <w:rPr>
-            <w:rStyle w:val="Lienhypertexte"/>
-            <w:noProof/>
-          </w:rPr>
-          <w:t>Annexes</w:t>
-        </w:r>
-        <w:r>
-          <w:rPr>
-            <w:noProof/>
-            <w:webHidden/>
-          </w:rPr>
-          <w:tab/>
-        </w:r>
-        <w:r>
-          <w:rPr>
-            <w:noProof/>
-            <w:webHidden/>
-          </w:rPr>
-          <w:fldChar w:fldCharType="begin"/>
-        </w:r>
-        <w:r>
-          <w:rPr>
-            <w:noProof/>
-            <w:webHidden/>
-          </w:rPr>
-          <w:instrText xml:space="preserve"> PAGEREF _Toc308526350 \h </w:instrText>
-        </w:r>
-        <w:r>
-          <w:rPr>
-            <w:noProof/>
-            <w:webHidden/>
-          </w:rPr>
-        </w:r>
-        <w:r>
-          <w:rPr>
-            <w:noProof/>
-            <w:webHidden/>
-          </w:rPr>
-          <w:fldChar w:fldCharType="separate"/>
-        </w:r>
-        <w:r>
-          <w:rPr>
-            <w:noProof/>
-            <w:webHidden/>
-          </w:rPr>
-          <w:t>6</w:t>
         </w:r>
         <w:r>
           <w:rPr>
@@ -3397,7 +1711,7 @@
       </w:pPr>
       <w:bookmarkStart w:id="0" w:name="_Toc532179955"/>
       <w:bookmarkStart w:id="1" w:name="_Toc165969637"/>
-      <w:bookmarkStart w:id="2" w:name="_Toc308526316"/>
+      <w:bookmarkStart w:id="2" w:name="_Toc218496169"/>
       <w:r>
         <w:lastRenderedPageBreak/>
         <w:t>Spécifications</w:t>
@@ -3415,9 +1729,9 @@
       <w:pPr>
         <w:pStyle w:val="Titre2"/>
       </w:pPr>
-      <w:bookmarkStart w:id="3" w:name="_Toc308526317"/>
-      <w:bookmarkStart w:id="4" w:name="_Toc532179969"/>
-      <w:bookmarkStart w:id="5" w:name="_Toc165969639"/>
+      <w:bookmarkStart w:id="3" w:name="_Toc532179969"/>
+      <w:bookmarkStart w:id="4" w:name="_Toc165969639"/>
+      <w:bookmarkStart w:id="5" w:name="_Toc218496170"/>
       <w:r>
         <w:t>T</w:t>
       </w:r>
@@ -3427,7 +1741,7 @@
       <w:r>
         <w:t>e</w:t>
       </w:r>
-      <w:bookmarkEnd w:id="3"/>
+      <w:bookmarkEnd w:id="5"/>
     </w:p>
     <w:p>
       <w:pPr>
@@ -3438,13 +1752,8 @@
         <w:t xml:space="preserve">P_Cloud_346 : </w:t>
       </w:r>
       <w:r>
-        <w:t xml:space="preserve">Cloud </w:t>
-      </w:r>
-      <w:proofErr w:type="spellStart"/>
-      <w:r>
-        <w:t>Webapp</w:t>
-      </w:r>
-      <w:proofErr w:type="spellEnd"/>
+        <w:t>Cloud Webapp</w:t>
+      </w:r>
     </w:p>
     <w:p>
       <w:pPr>
@@ -3455,7 +1764,7 @@
       <w:pPr>
         <w:pStyle w:val="Titre2"/>
       </w:pPr>
-      <w:bookmarkStart w:id="6" w:name="_Toc308526318"/>
+      <w:bookmarkStart w:id="6" w:name="_Toc218496171"/>
       <w:r>
         <w:t>Description</w:t>
       </w:r>
@@ -3473,29 +1782,13 @@
         <w:t xml:space="preserve"> (</w:t>
       </w:r>
       <w:r>
-        <w:t xml:space="preserve">Microsoft </w:t>
-      </w:r>
-      <w:proofErr w:type="spellStart"/>
-      <w:r>
-        <w:t>Authentication</w:t>
-      </w:r>
-      <w:proofErr w:type="spellEnd"/>
-      <w:r>
-        <w:t xml:space="preserve"> Library</w:t>
+        <w:t>Microsoft Authentication Library</w:t>
       </w:r>
       <w:r>
         <w:t>)</w:t>
       </w:r>
       <w:r>
-        <w:t xml:space="preserve"> ainsi que la migration ou création d’une fonctionnalité en mode </w:t>
-      </w:r>
-      <w:proofErr w:type="spellStart"/>
-      <w:r>
-        <w:t>serverless</w:t>
-      </w:r>
-      <w:proofErr w:type="spellEnd"/>
-      <w:r>
-        <w:t>. Le travail demande également la configuration d’un pipeline CI/CD automatisé et une optimisation des ressources cloud pour limiter les coûts. L’objectif global est de comprendre et maîtriser un déploiement complet en environnement cloud, de la mise en production jusqu’à la gestion des services associés.</w:t>
+        <w:t xml:space="preserve"> ainsi que la migration ou création d’une fonctionnalité en mode serverless. Le travail demande également la configuration d’un pipeline CI/CD automatisé et une optimisation des ressources cloud pour limiter les coûts. L’objectif global est de comprendre et maîtriser un déploiement complet en environnement cloud, de la mise en production jusqu’à la gestion des services associés.</w:t>
       </w:r>
     </w:p>
     <w:p>
@@ -3503,23 +1796,27 @@
         <w:pStyle w:val="Retraitcorpsdetexte"/>
       </w:pPr>
     </w:p>
-    <w:bookmarkEnd w:id="4"/>
-    <w:bookmarkEnd w:id="5"/>
     <w:p>
       <w:pPr>
         <w:pStyle w:val="Titre1"/>
       </w:pPr>
+      <w:bookmarkStart w:id="7" w:name="_Toc218496172"/>
+      <w:bookmarkEnd w:id="3"/>
+      <w:bookmarkEnd w:id="4"/>
       <w:r>
         <w:t>Réalisation</w:t>
       </w:r>
+      <w:bookmarkEnd w:id="7"/>
     </w:p>
     <w:p>
       <w:pPr>
         <w:pStyle w:val="Titre2"/>
       </w:pPr>
+      <w:bookmarkStart w:id="8" w:name="_Toc218496173"/>
       <w:r>
         <w:t>Problèmes rencontrés</w:t>
       </w:r>
+      <w:bookmarkEnd w:id="8"/>
     </w:p>
     <w:p>
       <w:pPr>
@@ -3535,12 +1832,14 @@
       <w:pPr>
         <w:pStyle w:val="Titre2"/>
       </w:pPr>
+      <w:bookmarkStart w:id="9" w:name="_Toc218496174"/>
       <w:r>
         <w:t>C</w:t>
       </w:r>
       <w:r>
         <w:t>onnaissances acquises</w:t>
       </w:r>
+      <w:bookmarkEnd w:id="9"/>
     </w:p>
     <w:p>
       <w:pPr>
@@ -3556,12 +1855,14 @@
       <w:pPr>
         <w:pStyle w:val="Titre2"/>
       </w:pPr>
+      <w:bookmarkStart w:id="10" w:name="_Toc218496175"/>
       <w:r>
         <w:t>R</w:t>
       </w:r>
       <w:r>
         <w:t>épartition des tâches</w:t>
       </w:r>
+      <w:bookmarkEnd w:id="10"/>
     </w:p>
     <w:p>
       <w:pPr>
@@ -3577,24 +1878,18 @@
       <w:pPr>
         <w:pStyle w:val="Titre2"/>
       </w:pPr>
+      <w:bookmarkStart w:id="11" w:name="_Toc218496176"/>
       <w:r>
         <w:t>Comment fonctionne l’authentification MSAL</w:t>
       </w:r>
+      <w:bookmarkEnd w:id="11"/>
     </w:p>
     <w:p>
       <w:pPr>
         <w:pStyle w:val="Retraitcorpsdetexte"/>
       </w:pPr>
       <w:r>
-        <w:t xml:space="preserve">L'authentification MSAL (Microsoft </w:t>
-      </w:r>
-      <w:proofErr w:type="spellStart"/>
-      <w:r>
-        <w:t>Authentication</w:t>
-      </w:r>
-      <w:proofErr w:type="spellEnd"/>
-      <w:r>
-        <w:t xml:space="preserve"> Library) est le mécanisme que nous avons implémenté pour utiliser Azure Active Directory (Azure AD) comme fournisseur d'identité sécurisé pour notre application Passion Lecture.</w:t>
+        <w:t>L'authentification MSAL (Microsoft Authentication Library) est le mécanisme que nous avons implémenté pour utiliser Azure Active Directory (Azure AD) comme fournisseur d'identité sécurisé pour notre application Passion Lecture.</w:t>
       </w:r>
     </w:p>
     <w:p>
@@ -3607,15 +1902,7 @@
         <w:pStyle w:val="Retraitcorpsdetexte"/>
       </w:pPr>
       <w:r>
-        <w:t xml:space="preserve">Le fonctionnement de MSAL repose sur le protocole </w:t>
-      </w:r>
-      <w:proofErr w:type="spellStart"/>
-      <w:r>
-        <w:t>OAuth</w:t>
-      </w:r>
-      <w:proofErr w:type="spellEnd"/>
-      <w:r>
-        <w:t xml:space="preserve"> 2.0 (spécifiquement le flux "Code d'Autorisation avec PKCE").</w:t>
+        <w:t>Le fonctionnement de MSAL repose sur le protocole OAuth 2.0 (spécifiquement le flux "Code d'Autorisation avec PKCE").</w:t>
       </w:r>
     </w:p>
     <w:p>
@@ -3662,15 +1949,7 @@
         </w:numPr>
       </w:pPr>
       <w:r>
-        <w:t>Son rôle est de déléguer la vérification de l'identité à Azure AD et de gérer les jetons (</w:t>
-      </w:r>
-      <w:proofErr w:type="spellStart"/>
-      <w:r>
-        <w:t>Tokens</w:t>
-      </w:r>
-      <w:proofErr w:type="spellEnd"/>
-      <w:r>
-        <w:t>) nécessaires pour sécuriser les appels d'API.</w:t>
+        <w:t>Son rôle est de déléguer la vérification de l'identité à Azure AD et de gérer les jetons (Tokens) nécessaires pour sécuriser les appels d'API.</w:t>
       </w:r>
     </w:p>
     <w:p>
@@ -3735,15 +2014,7 @@
         </w:numPr>
       </w:pPr>
       <w:r>
-        <w:t xml:space="preserve">Échange Sécurisé : L'application (notre Backend), en arrière-plan, échange ce Code d'Autorisation contre des jetons d'accès (Access </w:t>
-      </w:r>
-      <w:proofErr w:type="spellStart"/>
-      <w:r>
-        <w:t>Token</w:t>
-      </w:r>
-      <w:proofErr w:type="spellEnd"/>
-      <w:r>
-        <w:t>) auprès d'Azure AD. Cet échange est sécurisé grâce au mécanisme PKCE.</w:t>
+        <w:t>Échange Sécurisé : L'application (notre Backend), en arrière-plan, échange ce Code d'Autorisation contre des jetons d'accès (Access Token) auprès d'Azure AD. Cet échange est sécurisé grâce au mécanisme PKCE.</w:t>
       </w:r>
     </w:p>
     <w:p>
@@ -3761,31 +2032,7 @@
         </w:numPr>
       </w:pPr>
       <w:r>
-        <w:t xml:space="preserve">Accès aux Ressources : L'Access </w:t>
-      </w:r>
-      <w:proofErr w:type="spellStart"/>
-      <w:r>
-        <w:t>Token</w:t>
-      </w:r>
-      <w:proofErr w:type="spellEnd"/>
-      <w:r>
-        <w:t xml:space="preserve"> est ensuite inclus dans l'en-tête de chaque requête API de l'application (en tant que "</w:t>
-      </w:r>
-      <w:proofErr w:type="spellStart"/>
-      <w:r>
-        <w:t>Bearer</w:t>
-      </w:r>
-      <w:proofErr w:type="spellEnd"/>
-      <w:r>
-        <w:t xml:space="preserve"> </w:t>
-      </w:r>
-      <w:proofErr w:type="spellStart"/>
-      <w:r>
-        <w:t>Token</w:t>
-      </w:r>
-      <w:proofErr w:type="spellEnd"/>
-      <w:r>
-        <w:t>"). Notre Backend vérifie la validité de ce jeton pour autoriser l'accès aux données de l'API.</w:t>
+        <w:t>Accès aux Ressources : L'Access Token est ensuite inclus dans l'en-tête de chaque requête API de l'application (en tant que "Bearer Token"). Notre Backend vérifie la validité de ce jeton pour autoriser l'accès aux données de l'API.</w:t>
       </w:r>
     </w:p>
     <w:p>
@@ -3843,15 +2090,7 @@
         </w:numPr>
       </w:pPr>
       <w:r>
-        <w:t xml:space="preserve">Améliorer l'UX (Expérience Utilisateur) en permettant le rafraîchissement des </w:t>
-      </w:r>
-      <w:proofErr w:type="spellStart"/>
-      <w:r>
-        <w:t>tokens</w:t>
-      </w:r>
-      <w:proofErr w:type="spellEnd"/>
-      <w:r>
-        <w:t xml:space="preserve"> silencieusement (sans forcer l'utilisateur à se reconnecter à chaque expiration).</w:t>
+        <w:t>Améliorer l'UX (Expérience Utilisateur) en permettant le rafraîchissement des tokens silencieusement (sans forcer l'utilisateur à se reconnecter à chaque expiration).</w:t>
       </w:r>
     </w:p>
     <w:p>
@@ -3863,19 +2102,14 @@
       <w:pPr>
         <w:pStyle w:val="Titre2"/>
       </w:pPr>
-      <w:proofErr w:type="gramStart"/>
+      <w:bookmarkStart w:id="12" w:name="_Toc218496177"/>
       <w:r>
         <w:t>Explica</w:t>
       </w:r>
       <w:r>
-        <w:t>tion .</w:t>
-      </w:r>
-      <w:proofErr w:type="spellStart"/>
-      <w:r>
-        <w:t>env</w:t>
-      </w:r>
-      <w:proofErr w:type="spellEnd"/>
-      <w:proofErr w:type="gramEnd"/>
+        <w:t>tion .env</w:t>
+      </w:r>
+      <w:bookmarkEnd w:id="12"/>
     </w:p>
     <w:p>
       <w:pPr>
@@ -3891,12 +2125,14 @@
       <w:pPr>
         <w:pStyle w:val="Titre2"/>
       </w:pPr>
+      <w:bookmarkStart w:id="13" w:name="_Toc218496178"/>
       <w:r>
         <w:t>S</w:t>
       </w:r>
       <w:r>
         <w:t>chéma</w:t>
       </w:r>
+      <w:bookmarkEnd w:id="13"/>
     </w:p>
     <w:p>
       <w:pPr>
@@ -3965,28 +2201,28 @@
       <w:pPr>
         <w:pStyle w:val="Titre1"/>
       </w:pPr>
-      <w:bookmarkStart w:id="7" w:name="_Toc165969653"/>
-      <w:bookmarkStart w:id="8" w:name="_Toc308526342"/>
+      <w:bookmarkStart w:id="14" w:name="_Toc165969653"/>
+      <w:bookmarkStart w:id="15" w:name="_Toc218496179"/>
       <w:r>
         <w:t>Conclusion</w:t>
       </w:r>
-      <w:bookmarkEnd w:id="7"/>
-      <w:bookmarkEnd w:id="8"/>
+      <w:bookmarkEnd w:id="14"/>
+      <w:bookmarkEnd w:id="15"/>
     </w:p>
     <w:p>
       <w:pPr>
         <w:pStyle w:val="Titre2"/>
       </w:pPr>
-      <w:bookmarkStart w:id="9" w:name="_Toc165969654"/>
-      <w:bookmarkStart w:id="10" w:name="_Toc308526343"/>
+      <w:bookmarkStart w:id="16" w:name="_Toc165969654"/>
+      <w:bookmarkStart w:id="17" w:name="_Toc218496180"/>
       <w:r>
         <w:t xml:space="preserve">Bilan des </w:t>
       </w:r>
-      <w:bookmarkEnd w:id="9"/>
+      <w:bookmarkEnd w:id="16"/>
       <w:r>
         <w:t>fonctionnalités demandées</w:t>
       </w:r>
-      <w:bookmarkEnd w:id="10"/>
+      <w:bookmarkEnd w:id="17"/>
     </w:p>
     <w:p>
       <w:pPr>
@@ -4025,13 +2261,13 @@
       <w:pPr>
         <w:pStyle w:val="Titre2"/>
       </w:pPr>
-      <w:bookmarkStart w:id="11" w:name="_Toc165969655"/>
-      <w:bookmarkStart w:id="12" w:name="_Toc308526344"/>
+      <w:bookmarkStart w:id="18" w:name="_Toc165969655"/>
+      <w:bookmarkStart w:id="19" w:name="_Toc218496181"/>
       <w:r>
         <w:t>Bilan de la planification</w:t>
       </w:r>
-      <w:bookmarkEnd w:id="11"/>
-      <w:bookmarkEnd w:id="12"/>
+      <w:bookmarkEnd w:id="18"/>
+      <w:bookmarkEnd w:id="19"/>
     </w:p>
     <w:p>
       <w:pPr>
@@ -4057,28 +2293,20 @@
         <w:t xml:space="preserve"> projet.</w:t>
       </w:r>
       <w:r>
-        <w:t xml:space="preserve"> Indiquer </w:t>
-      </w:r>
-      <w:proofErr w:type="gramStart"/>
-      <w:r>
-        <w:t>les différence</w:t>
-      </w:r>
-      <w:proofErr w:type="gramEnd"/>
-      <w:r>
-        <w:t xml:space="preserve"> entre les planifications initiales et détaillées avec le journal de travail.</w:t>
+        <w:t xml:space="preserve"> Indiquer les différence entre les planifications initiales et détaillées avec le journal de travail.</w:t>
       </w:r>
     </w:p>
     <w:p>
       <w:pPr>
         <w:pStyle w:val="Titre2"/>
       </w:pPr>
-      <w:bookmarkStart w:id="13" w:name="_Toc165969656"/>
-      <w:bookmarkStart w:id="14" w:name="_Toc308526345"/>
+      <w:bookmarkStart w:id="20" w:name="_Toc165969656"/>
+      <w:bookmarkStart w:id="21" w:name="_Toc218496182"/>
       <w:r>
         <w:t>Bilan personnel</w:t>
       </w:r>
-      <w:bookmarkEnd w:id="13"/>
-      <w:bookmarkEnd w:id="14"/>
+      <w:bookmarkEnd w:id="20"/>
+      <w:bookmarkEnd w:id="21"/>
     </w:p>
     <w:p>
       <w:pPr>
@@ -4089,16 +2317,11 @@
         </w:numPr>
       </w:pPr>
       <w:r>
-        <w:t xml:space="preserve">Si c’était à </w:t>
-      </w:r>
-      <w:proofErr w:type="gramStart"/>
-      <w:r>
-        <w:t>refaire</w:t>
+        <w:t>Si c’était à refaire</w:t>
       </w:r>
       <w:r>
         <w:t>:</w:t>
       </w:r>
-      <w:proofErr w:type="gramEnd"/>
     </w:p>
     <w:p>
       <w:pPr>
@@ -4165,13 +2388,8 @@
           <w:numId w:val="6"/>
         </w:numPr>
       </w:pPr>
-      <w:proofErr w:type="gramStart"/>
-      <w:r>
-        <w:t>Suite à</w:t>
-      </w:r>
-      <w:proofErr w:type="gramEnd"/>
-      <w:r>
-        <w:t xml:space="preserve"> donner, améliorations souhaitables, …</w:t>
+      <w:r>
+        <w:t>Suite à donner, améliorations souhaitables, …</w:t>
       </w:r>
     </w:p>
     <w:p>
@@ -4190,26 +2408,26 @@
       <w:pPr>
         <w:pStyle w:val="Titre1"/>
       </w:pPr>
-      <w:bookmarkStart w:id="15" w:name="_Toc532179971"/>
-      <w:bookmarkStart w:id="16" w:name="_Toc165969657"/>
-      <w:bookmarkStart w:id="17" w:name="_Toc308526346"/>
+      <w:bookmarkStart w:id="22" w:name="_Toc532179971"/>
+      <w:bookmarkStart w:id="23" w:name="_Toc165969657"/>
+      <w:bookmarkStart w:id="24" w:name="_Toc218496183"/>
       <w:r>
         <w:lastRenderedPageBreak/>
         <w:t>Divers</w:t>
       </w:r>
-      <w:bookmarkEnd w:id="15"/>
-      <w:bookmarkEnd w:id="16"/>
-      <w:bookmarkEnd w:id="17"/>
+      <w:bookmarkEnd w:id="22"/>
+      <w:bookmarkEnd w:id="23"/>
+      <w:bookmarkEnd w:id="24"/>
     </w:p>
     <w:p>
       <w:pPr>
         <w:pStyle w:val="Titre2"/>
       </w:pPr>
-      <w:bookmarkStart w:id="18" w:name="_Toc308526349"/>
+      <w:bookmarkStart w:id="25" w:name="_Toc218496184"/>
       <w:r>
         <w:t>Webographie</w:t>
       </w:r>
-      <w:bookmarkEnd w:id="18"/>
+      <w:bookmarkEnd w:id="25"/>
     </w:p>
     <w:p>
       <w:pPr>
@@ -4641,21 +2859,12 @@
               <w:szCs w:val="16"/>
             </w:rPr>
           </w:pPr>
-          <w:proofErr w:type="gramStart"/>
           <w:r>
             <w:rPr>
               <w:rFonts w:cs="Arial"/>
               <w:szCs w:val="16"/>
             </w:rPr>
-            <w:t>Version:</w:t>
-          </w:r>
-          <w:proofErr w:type="gramEnd"/>
-          <w:r>
-            <w:rPr>
-              <w:rFonts w:cs="Arial"/>
-              <w:szCs w:val="16"/>
-            </w:rPr>
-            <w:t xml:space="preserve"> </w:t>
+            <w:t xml:space="preserve">Version: </w:t>
           </w:r>
           <w:fldSimple w:instr=" REVNUM   \* MERGEFORMAT ">
             <w:r>
@@ -4701,7 +2910,7 @@
               <w:noProof/>
               <w:szCs w:val="16"/>
             </w:rPr>
-            <w:t>03.12.2025 16:28</w:t>
+            <w:t>10.12.2025 16:33</w:t>
           </w:r>
           <w:r>
             <w:rPr>
@@ -4913,7 +3122,7 @@
         <v:path o:extrusionok="f" gradientshapeok="t" o:connecttype="rect"/>
         <o:lock v:ext="edit" aspectratio="t"/>
       </v:shapetype>
-      <v:shape id="_x0000_i1032" type="#_x0000_t75" style="width:11.8pt;height:11.8pt" o:bullet="t">
+      <v:shape id="_x0000_i1030" type="#_x0000_t75" style="width:11.9pt;height:11.9pt" o:bullet="t">
         <v:imagedata r:id="rId1" o:title="BD10263_"/>
       </v:shape>
     </w:pict>
@@ -6863,7 +5072,6 @@
     <w:next w:val="Normal"/>
     <w:autoRedefine/>
     <w:uiPriority w:val="39"/>
-    <w:semiHidden/>
     <w:rsid w:val="00656974"/>
     <w:pPr>
       <w:spacing w:before="120" w:after="120"/>
@@ -6880,7 +5088,6 @@
     <w:next w:val="Normal"/>
     <w:autoRedefine/>
     <w:uiPriority w:val="39"/>
-    <w:semiHidden/>
     <w:rsid w:val="007F30AE"/>
     <w:pPr>
       <w:ind w:left="200"/>

</xml_diff>